<commit_message>
update to the Azure Assignment
</commit_message>
<xml_diff>
--- a/Azure_Assignment_sZz.docx
+++ b/Azure_Assignment_sZz.docx
@@ -530,6 +530,7 @@
           <w:color w:val="1A365D"/>
           <w:sz w:val="28"/>
         </w:rPr>
+        <w:lastRenderedPageBreak/>
         <w:t>3. Azure Resources to Create</w:t>
       </w:r>
     </w:p>
@@ -537,2413 +538,24 @@
       <w:pPr>
         <w:keepNext/>
         <w:spacing w:before="240" w:after="80"/>
-      </w:pPr>
-      <w:r>
         <w:rPr>
           <w:b/>
           <w:color w:val="2B6CAC"/>
           <w:sz w:val="24"/>
         </w:rPr>
-        <w:t>Resource Group</w:t>
-      </w:r>
+      </w:pPr>
     </w:p>
     <w:p>
       <w:pPr>
-        <w:spacing w:after="80"/>
-      </w:pPr>
-      <w:r>
-        <w:t>Name: RG-Retail-DataEngineering-Dev</w:t>
-      </w:r>
-    </w:p>
-    <w:p>
-      <w:pPr>
-        <w:spacing w:after="80"/>
-      </w:pPr>
-      <w:r>
-        <w:t>Purpose: Container for all Azure resources.</w:t>
-      </w:r>
-    </w:p>
-    <w:p>
-      <w:pPr>
         <w:keepNext/>
         <w:spacing w:before="240" w:after="80"/>
       </w:pPr>
       <w:r>
-        <w:rPr>
-          <w:b/>
-          <w:color w:val="2B6CAC"/>
-          <w:sz w:val="24"/>
-        </w:rPr>
-        <w:t>Storage Account</w:t>
-      </w:r>
-    </w:p>
-    <w:p>
-      <w:pPr>
-        <w:spacing w:after="80"/>
-      </w:pPr>
-      <w:r>
-        <w:t>Name: stretaildev001</w:t>
-      </w:r>
-    </w:p>
-    <w:p>
-      <w:pPr>
-        <w:spacing w:after="80"/>
-      </w:pPr>
-      <w:r>
-        <w:t>Enable:</w:t>
-      </w:r>
-    </w:p>
-    <w:p>
-      <w:pPr>
-        <w:pStyle w:val="ListBullet"/>
-        <w:spacing w:after="60"/>
-        <w:ind w:left="720"/>
-      </w:pPr>
-      <w:r>
-        <w:t>Hierarchical Namespace</w:t>
-      </w:r>
-    </w:p>
-    <w:p>
-      <w:pPr>
-        <w:pStyle w:val="ListBullet"/>
-        <w:spacing w:after="60"/>
-        <w:ind w:left="720"/>
-      </w:pPr>
-      <w:r>
-        <w:t>ADLS Gen2</w:t>
-      </w:r>
-    </w:p>
-    <w:p>
-      <w:pPr>
-        <w:spacing w:after="80"/>
-      </w:pPr>
-      <w:r>
-        <w:t>Containers:</w:t>
-      </w:r>
-    </w:p>
-    <w:p>
-      <w:pPr>
-        <w:pStyle w:val="ListBullet"/>
-        <w:spacing w:after="60"/>
-        <w:ind w:left="720"/>
-      </w:pPr>
-      <w:r>
-        <w:t>raw</w:t>
-      </w:r>
-    </w:p>
-    <w:p>
-      <w:pPr>
-        <w:pStyle w:val="ListBullet"/>
-        <w:spacing w:after="60"/>
-        <w:ind w:left="720"/>
-      </w:pPr>
-      <w:r>
-        <w:t>processed</w:t>
-      </w:r>
-    </w:p>
-    <w:p>
-      <w:pPr>
-        <w:pStyle w:val="ListBullet"/>
-        <w:spacing w:after="60"/>
-        <w:ind w:left="720"/>
-      </w:pPr>
-      <w:r>
-        <w:t>curated</w:t>
-      </w:r>
-    </w:p>
-    <w:p>
-      <w:pPr>
-        <w:pStyle w:val="ListBullet"/>
-        <w:spacing w:after="60"/>
-        <w:ind w:left="720"/>
-      </w:pPr>
-      <w:r>
-        <w:t>archive</w:t>
-      </w:r>
-    </w:p>
-    <w:p>
-      <w:pPr>
-        <w:pStyle w:val="ListBullet"/>
-        <w:spacing w:after="60"/>
-        <w:ind w:left="720"/>
-      </w:pPr>
-      <w:r>
-        <w:t>error</w:t>
-      </w:r>
-    </w:p>
-    <w:p>
-      <w:pPr>
-        <w:keepNext/>
-        <w:spacing w:before="240" w:after="80"/>
-      </w:pPr>
-      <w:r>
-        <w:rPr>
-          <w:b/>
-          <w:color w:val="2B6CAC"/>
-          <w:sz w:val="24"/>
-        </w:rPr>
-        <w:lastRenderedPageBreak/>
-        <w:t>Azure Data Factory</w:t>
-      </w:r>
-    </w:p>
-    <w:p>
-      <w:pPr>
-        <w:spacing w:after="80"/>
-      </w:pPr>
-      <w:r>
-        <w:t>Name: ADF-Retail-Dev</w:t>
-      </w:r>
-    </w:p>
-    <w:p>
-      <w:pPr>
-        <w:spacing w:after="80"/>
-      </w:pPr>
-      <w:r>
-        <w:t>Purpose: Pipeline orchestration.</w:t>
-      </w:r>
-    </w:p>
-    <w:p>
-      <w:pPr>
-        <w:keepNext/>
-        <w:spacing w:before="240" w:after="80"/>
-      </w:pPr>
-      <w:r>
-        <w:rPr>
-          <w:b/>
-          <w:color w:val="2B6CAC"/>
-          <w:sz w:val="24"/>
-        </w:rPr>
-        <w:t>Azure SQL Database</w:t>
-      </w:r>
-    </w:p>
-    <w:p>
-      <w:pPr>
-        <w:spacing w:after="80"/>
-      </w:pPr>
-      <w:r>
-        <w:t>Server: sql-retail-dev</w:t>
-      </w:r>
-    </w:p>
-    <w:p>
-      <w:pPr>
-        <w:spacing w:after="80"/>
-      </w:pPr>
-      <w:r>
-        <w:t>Database: RetailDW</w:t>
-      </w:r>
-    </w:p>
-    <w:p>
-      <w:pPr>
-        <w:spacing w:after="80"/>
-      </w:pPr>
-      <w:r>
-        <w:t>Purpose: Store transformed sales data.</w:t>
-      </w:r>
-    </w:p>
-    <w:p>
-      <w:pPr>
-        <w:keepNext/>
-        <w:spacing w:before="240" w:after="80"/>
-      </w:pPr>
-      <w:r>
-        <w:rPr>
-          <w:b/>
-          <w:color w:val="2B6CAC"/>
-          <w:sz w:val="24"/>
-        </w:rPr>
-        <w:t>Azure Key Vault</w:t>
-      </w:r>
-    </w:p>
-    <w:p>
-      <w:pPr>
-        <w:spacing w:after="80"/>
-      </w:pPr>
-      <w:r>
-        <w:t>Name: KV-Retail-Dev</w:t>
-      </w:r>
-    </w:p>
-    <w:p>
-      <w:pPr>
-        <w:spacing w:after="80"/>
-      </w:pPr>
-      <w:r>
-        <w:t>Purpose: Store AWS Access Key, AWS Secret Key, SQL Password, Storage Account Keys</w:t>
-      </w:r>
-    </w:p>
-    <w:p>
-      <w:pPr>
-        <w:keepNext/>
-        <w:spacing w:before="240" w:after="80"/>
-      </w:pPr>
-      <w:r>
-        <w:rPr>
-          <w:b/>
-          <w:color w:val="2B6CAC"/>
-          <w:sz w:val="24"/>
-        </w:rPr>
-        <w:t>Log Analytics Workspace</w:t>
-      </w:r>
-    </w:p>
-    <w:p>
-      <w:pPr>
-        <w:spacing w:after="80"/>
-      </w:pPr>
-      <w:r>
-        <w:t>Name: LAW-Retail-Dev</w:t>
-      </w:r>
-    </w:p>
-    <w:p>
-      <w:pPr>
-        <w:spacing w:after="80"/>
-      </w:pPr>
-      <w:r>
-        <w:t>Purpose: Monitoring and diagnostics.</w:t>
-      </w:r>
-    </w:p>
-    <w:p>
-      <w:pPr>
-        <w:keepNext/>
-        <w:pBdr>
-          <w:bottom w:val="single" w:sz="6" w:space="1" w:color="2B6CAC"/>
-        </w:pBdr>
-        <w:spacing w:before="360" w:after="120"/>
-      </w:pPr>
-      <w:r>
-        <w:rPr>
-          <w:b/>
-          <w:color w:val="1A365D"/>
-          <w:sz w:val="28"/>
-        </w:rPr>
-        <w:t>4. Create Source Datasets</w:t>
-      </w:r>
-    </w:p>
-    <w:p>
-      <w:pPr>
-        <w:keepNext/>
-        <w:spacing w:before="240" w:after="80"/>
-      </w:pPr>
-      <w:r>
-        <w:rPr>
-          <w:b/>
-          <w:color w:val="2B6CAC"/>
-          <w:sz w:val="24"/>
-        </w:rPr>
-        <w:t>Dataset 1: sales_data.csv</w:t>
-      </w:r>
-    </w:p>
-    <w:p>
-      <w:pPr>
-        <w:spacing w:after="80"/>
-      </w:pPr>
-      <w:r>
-        <w:t>Columns:</w:t>
-      </w:r>
-    </w:p>
-    <w:p>
-      <w:pPr>
-        <w:pStyle w:val="ListBullet"/>
-        <w:spacing w:after="60"/>
-      </w:pPr>
-      <w:r>
-        <w:t>OrderID</w:t>
-      </w:r>
-    </w:p>
-    <w:p>
-      <w:pPr>
-        <w:pStyle w:val="ListBullet"/>
-        <w:spacing w:after="60"/>
-      </w:pPr>
-      <w:r>
-        <w:t>CustomerID</w:t>
-      </w:r>
-    </w:p>
-    <w:p>
-      <w:pPr>
-        <w:pStyle w:val="ListBullet"/>
-        <w:spacing w:after="60"/>
-      </w:pPr>
-      <w:r>
-        <w:t>ProductID</w:t>
-      </w:r>
-    </w:p>
-    <w:p>
-      <w:pPr>
-        <w:pStyle w:val="ListBullet"/>
-        <w:spacing w:after="60"/>
-      </w:pPr>
-      <w:r>
-        <w:t>Quantity</w:t>
-      </w:r>
-    </w:p>
-    <w:p>
-      <w:pPr>
-        <w:pStyle w:val="ListBullet"/>
-        <w:spacing w:after="60"/>
-      </w:pPr>
-      <w:r>
-        <w:t>UnitPrice</w:t>
-      </w:r>
-    </w:p>
-    <w:p>
-      <w:pPr>
-        <w:pStyle w:val="ListBullet"/>
-        <w:spacing w:after="60"/>
-      </w:pPr>
-      <w:r>
-        <w:t>OrderDate</w:t>
-      </w:r>
-    </w:p>
-    <w:p>
-      <w:pPr>
-        <w:pStyle w:val="ListBullet"/>
-        <w:spacing w:after="60"/>
-      </w:pPr>
-      <w:r>
-        <w:t>Country</w:t>
-      </w:r>
-    </w:p>
-    <w:p>
-      <w:pPr>
-        <w:pStyle w:val="ListBullet"/>
-        <w:spacing w:after="60"/>
-      </w:pPr>
-      <w:r>
-        <w:t>SalesChannel</w:t>
-      </w:r>
-    </w:p>
-    <w:p>
-      <w:pPr>
-        <w:keepNext/>
-        <w:spacing w:before="240" w:after="80"/>
-      </w:pPr>
-      <w:r>
-        <w:rPr>
-          <w:b/>
-          <w:color w:val="2B6CAC"/>
-          <w:sz w:val="24"/>
-        </w:rPr>
-        <w:t>Dataset 2: customer_data.csv</w:t>
-      </w:r>
-    </w:p>
-    <w:p>
-      <w:pPr>
-        <w:spacing w:after="80"/>
-      </w:pPr>
-      <w:r>
-        <w:t>Columns:</w:t>
-      </w:r>
-    </w:p>
-    <w:p>
-      <w:pPr>
-        <w:pStyle w:val="ListBullet"/>
-        <w:spacing w:after="60"/>
-      </w:pPr>
-      <w:r>
-        <w:t>CustomerID</w:t>
-      </w:r>
-    </w:p>
-    <w:p>
-      <w:pPr>
-        <w:pStyle w:val="ListBullet"/>
-        <w:spacing w:after="60"/>
-      </w:pPr>
-      <w:r>
-        <w:t>CustomerName</w:t>
-      </w:r>
-    </w:p>
-    <w:p>
-      <w:pPr>
-        <w:pStyle w:val="ListBullet"/>
-        <w:spacing w:after="60"/>
-      </w:pPr>
-      <w:r>
-        <w:t>Email</w:t>
-      </w:r>
-    </w:p>
-    <w:p>
-      <w:pPr>
-        <w:pStyle w:val="ListBullet"/>
-        <w:spacing w:after="60"/>
-      </w:pPr>
-      <w:r>
-        <w:t>Country</w:t>
-      </w:r>
-    </w:p>
-    <w:p>
-      <w:pPr>
-        <w:pStyle w:val="ListBullet"/>
-        <w:spacing w:after="60"/>
-      </w:pPr>
-      <w:r>
-        <w:t>CustomerSegment</w:t>
-      </w:r>
-    </w:p>
-    <w:p>
-      <w:pPr>
-        <w:keepNext/>
-        <w:spacing w:before="240" w:after="80"/>
-      </w:pPr>
-      <w:r>
-        <w:rPr>
-          <w:b/>
-          <w:color w:val="2B6CAC"/>
-          <w:sz w:val="24"/>
-        </w:rPr>
-        <w:lastRenderedPageBreak/>
-        <w:t>Dataset 3: product_data.csv</w:t>
-      </w:r>
-    </w:p>
-    <w:p>
-      <w:pPr>
-        <w:spacing w:after="80"/>
-      </w:pPr>
-      <w:r>
-        <w:t>Columns:</w:t>
-      </w:r>
-    </w:p>
-    <w:p>
-      <w:pPr>
-        <w:pStyle w:val="ListBullet"/>
-        <w:spacing w:after="60"/>
-      </w:pPr>
-      <w:r>
-        <w:t>ProductID</w:t>
-      </w:r>
-    </w:p>
-    <w:p>
-      <w:pPr>
-        <w:pStyle w:val="ListBullet"/>
-        <w:spacing w:after="60"/>
-      </w:pPr>
-      <w:r>
-        <w:t>ProductName</w:t>
-      </w:r>
-    </w:p>
-    <w:p>
-      <w:pPr>
-        <w:pStyle w:val="ListBullet"/>
-        <w:spacing w:after="60"/>
-      </w:pPr>
-      <w:r>
-        <w:t>Category</w:t>
-      </w:r>
-    </w:p>
-    <w:p>
-      <w:pPr>
-        <w:pStyle w:val="ListBullet"/>
-        <w:spacing w:after="60"/>
-      </w:pPr>
-      <w:r>
-        <w:t>CostPrice</w:t>
-      </w:r>
-    </w:p>
-    <w:p>
-      <w:pPr>
-        <w:pStyle w:val="ListBullet"/>
-        <w:spacing w:after="60"/>
-      </w:pPr>
-      <w:r>
-        <w:t>SellingPrice</w:t>
-      </w:r>
-    </w:p>
-    <w:p>
-      <w:pPr>
-        <w:keepNext/>
-        <w:pBdr>
-          <w:bottom w:val="single" w:sz="6" w:space="1" w:color="2B6CAC"/>
-        </w:pBdr>
-        <w:spacing w:before="360" w:after="120"/>
-      </w:pPr>
-      <w:r>
-        <w:rPr>
-          <w:b/>
-          <w:color w:val="1A365D"/>
-          <w:sz w:val="28"/>
-        </w:rPr>
-        <w:t>5. Sample Sales Data</w:t>
-      </w:r>
-    </w:p>
-    <w:p>
-      <w:pPr>
-        <w:keepNext/>
-        <w:spacing w:before="240" w:after="80"/>
-      </w:pPr>
-      <w:r>
-        <w:rPr>
-          <w:b/>
-          <w:color w:val="2B6CAC"/>
-          <w:sz w:val="24"/>
-        </w:rPr>
-        <w:t>sales_data.csv</w:t>
-      </w:r>
-    </w:p>
-    <w:tbl>
-      <w:tblPr>
-        <w:tblW w:w="0" w:type="auto"/>
-        <w:jc w:val="center"/>
-        <w:tblBorders>
-          <w:top w:val="single" w:sz="4" w:space="0" w:color="D3D3D3"/>
-          <w:bottom w:val="single" w:sz="8" w:space="0" w:color="A0AEC0"/>
-          <w:insideH w:val="single" w:sz="4" w:space="0" w:color="E2E8F0"/>
-        </w:tblBorders>
-        <w:tblLook w:val="04A0" w:firstRow="1" w:lastRow="0" w:firstColumn="1" w:lastColumn="0" w:noHBand="0" w:noVBand="1"/>
-      </w:tblPr>
-      <w:tblGrid>
-        <w:gridCol w:w="1154"/>
-        <w:gridCol w:w="1284"/>
-        <w:gridCol w:w="1167"/>
-        <w:gridCol w:w="1159"/>
-        <w:gridCol w:w="1162"/>
-        <w:gridCol w:w="1181"/>
-        <w:gridCol w:w="1153"/>
-        <w:gridCol w:w="1400"/>
-      </w:tblGrid>
-      <w:tr>
-        <w:trPr>
-          <w:jc w:val="center"/>
-        </w:trPr>
-        <w:tc>
-          <w:tcPr>
-            <w:tcW w:w="1170" w:type="dxa"/>
-            <w:shd w:val="clear" w:color="auto" w:fill="1A365D"/>
-            <w:tcMar>
-              <w:top w:w="100" w:type="dxa"/>
-              <w:left w:w="150" w:type="dxa"/>
-              <w:bottom w:w="100" w:type="dxa"/>
-              <w:right w:w="150" w:type="dxa"/>
-            </w:tcMar>
-            <w:vAlign w:val="center"/>
-          </w:tcPr>
-          <w:p>
-            <w:pPr>
-              <w:spacing w:before="40" w:after="40"/>
-            </w:pPr>
-            <w:r>
-              <w:rPr>
-                <w:b/>
-                <w:color w:val="FFFFFF"/>
-                <w:sz w:val="20"/>
-              </w:rPr>
-              <w:t>OrderID</w:t>
-            </w:r>
-          </w:p>
-        </w:tc>
-        <w:tc>
-          <w:tcPr>
-            <w:tcW w:w="1170" w:type="dxa"/>
-            <w:shd w:val="clear" w:color="auto" w:fill="1A365D"/>
-            <w:tcMar>
-              <w:top w:w="100" w:type="dxa"/>
-              <w:left w:w="150" w:type="dxa"/>
-              <w:bottom w:w="100" w:type="dxa"/>
-              <w:right w:w="150" w:type="dxa"/>
-            </w:tcMar>
-            <w:vAlign w:val="center"/>
-          </w:tcPr>
-          <w:p>
-            <w:pPr>
-              <w:spacing w:before="40" w:after="40"/>
-            </w:pPr>
-            <w:r>
-              <w:rPr>
-                <w:b/>
-                <w:color w:val="FFFFFF"/>
-                <w:sz w:val="20"/>
-              </w:rPr>
-              <w:t>CustomerID</w:t>
-            </w:r>
-          </w:p>
-        </w:tc>
-        <w:tc>
-          <w:tcPr>
-            <w:tcW w:w="1170" w:type="dxa"/>
-            <w:shd w:val="clear" w:color="auto" w:fill="1A365D"/>
-            <w:tcMar>
-              <w:top w:w="100" w:type="dxa"/>
-              <w:left w:w="150" w:type="dxa"/>
-              <w:bottom w:w="100" w:type="dxa"/>
-              <w:right w:w="150" w:type="dxa"/>
-            </w:tcMar>
-            <w:vAlign w:val="center"/>
-          </w:tcPr>
-          <w:p>
-            <w:pPr>
-              <w:spacing w:before="40" w:after="40"/>
-            </w:pPr>
-            <w:r>
-              <w:rPr>
-                <w:b/>
-                <w:color w:val="FFFFFF"/>
-                <w:sz w:val="20"/>
-              </w:rPr>
-              <w:t>ProductID</w:t>
-            </w:r>
-          </w:p>
-        </w:tc>
-        <w:tc>
-          <w:tcPr>
-            <w:tcW w:w="1170" w:type="dxa"/>
-            <w:shd w:val="clear" w:color="auto" w:fill="1A365D"/>
-            <w:tcMar>
-              <w:top w:w="100" w:type="dxa"/>
-              <w:left w:w="150" w:type="dxa"/>
-              <w:bottom w:w="100" w:type="dxa"/>
-              <w:right w:w="150" w:type="dxa"/>
-            </w:tcMar>
-            <w:vAlign w:val="center"/>
-          </w:tcPr>
-          <w:p>
-            <w:pPr>
-              <w:spacing w:before="40" w:after="40"/>
-            </w:pPr>
-            <w:r>
-              <w:rPr>
-                <w:b/>
-                <w:color w:val="FFFFFF"/>
-                <w:sz w:val="20"/>
-              </w:rPr>
-              <w:t>Quantity</w:t>
-            </w:r>
-          </w:p>
-        </w:tc>
-        <w:tc>
-          <w:tcPr>
-            <w:tcW w:w="1170" w:type="dxa"/>
-            <w:shd w:val="clear" w:color="auto" w:fill="1A365D"/>
-            <w:tcMar>
-              <w:top w:w="100" w:type="dxa"/>
-              <w:left w:w="150" w:type="dxa"/>
-              <w:bottom w:w="100" w:type="dxa"/>
-              <w:right w:w="150" w:type="dxa"/>
-            </w:tcMar>
-            <w:vAlign w:val="center"/>
-          </w:tcPr>
-          <w:p>
-            <w:pPr>
-              <w:spacing w:before="40" w:after="40"/>
-            </w:pPr>
-            <w:r>
-              <w:rPr>
-                <w:b/>
-                <w:color w:val="FFFFFF"/>
-                <w:sz w:val="20"/>
-              </w:rPr>
-              <w:t>UnitPrice</w:t>
-            </w:r>
-          </w:p>
-        </w:tc>
-        <w:tc>
-          <w:tcPr>
-            <w:tcW w:w="1170" w:type="dxa"/>
-            <w:shd w:val="clear" w:color="auto" w:fill="1A365D"/>
-            <w:tcMar>
-              <w:top w:w="100" w:type="dxa"/>
-              <w:left w:w="150" w:type="dxa"/>
-              <w:bottom w:w="100" w:type="dxa"/>
-              <w:right w:w="150" w:type="dxa"/>
-            </w:tcMar>
-            <w:vAlign w:val="center"/>
-          </w:tcPr>
-          <w:p>
-            <w:pPr>
-              <w:spacing w:before="40" w:after="40"/>
-            </w:pPr>
-            <w:r>
-              <w:rPr>
-                <w:b/>
-                <w:color w:val="FFFFFF"/>
-                <w:sz w:val="20"/>
-              </w:rPr>
-              <w:t>OrderDate</w:t>
-            </w:r>
-          </w:p>
-        </w:tc>
-        <w:tc>
-          <w:tcPr>
-            <w:tcW w:w="1170" w:type="dxa"/>
-            <w:shd w:val="clear" w:color="auto" w:fill="1A365D"/>
-            <w:tcMar>
-              <w:top w:w="100" w:type="dxa"/>
-              <w:left w:w="150" w:type="dxa"/>
-              <w:bottom w:w="100" w:type="dxa"/>
-              <w:right w:w="150" w:type="dxa"/>
-            </w:tcMar>
-            <w:vAlign w:val="center"/>
-          </w:tcPr>
-          <w:p>
-            <w:pPr>
-              <w:spacing w:before="40" w:after="40"/>
-            </w:pPr>
-            <w:r>
-              <w:rPr>
-                <w:b/>
-                <w:color w:val="FFFFFF"/>
-                <w:sz w:val="20"/>
-              </w:rPr>
-              <w:t>Country</w:t>
-            </w:r>
-          </w:p>
-        </w:tc>
-        <w:tc>
-          <w:tcPr>
-            <w:tcW w:w="1170" w:type="dxa"/>
-            <w:shd w:val="clear" w:color="auto" w:fill="1A365D"/>
-            <w:tcMar>
-              <w:top w:w="100" w:type="dxa"/>
-              <w:left w:w="150" w:type="dxa"/>
-              <w:bottom w:w="100" w:type="dxa"/>
-              <w:right w:w="150" w:type="dxa"/>
-            </w:tcMar>
-            <w:vAlign w:val="center"/>
-          </w:tcPr>
-          <w:p>
-            <w:pPr>
-              <w:spacing w:before="40" w:after="40"/>
-            </w:pPr>
-            <w:r>
-              <w:rPr>
-                <w:b/>
-                <w:color w:val="FFFFFF"/>
-                <w:sz w:val="20"/>
-              </w:rPr>
-              <w:t>SalesChannel</w:t>
-            </w:r>
-          </w:p>
-        </w:tc>
-      </w:tr>
-      <w:tr>
-        <w:trPr>
-          <w:jc w:val="center"/>
-        </w:trPr>
-        <w:tc>
-          <w:tcPr>
-            <w:tcW w:w="1170" w:type="dxa"/>
-            <w:shd w:val="clear" w:color="auto" w:fill="FFFFFF"/>
-            <w:tcMar>
-              <w:top w:w="100" w:type="dxa"/>
-              <w:left w:w="150" w:type="dxa"/>
-              <w:bottom w:w="100" w:type="dxa"/>
-              <w:right w:w="150" w:type="dxa"/>
-            </w:tcMar>
-            <w:vAlign w:val="center"/>
-          </w:tcPr>
-          <w:p>
-            <w:pPr>
-              <w:spacing w:before="40" w:after="40"/>
-            </w:pPr>
-            <w:r>
-              <w:rPr>
-                <w:sz w:val="20"/>
-              </w:rPr>
-              <w:t>1001</w:t>
-            </w:r>
-          </w:p>
-        </w:tc>
-        <w:tc>
-          <w:tcPr>
-            <w:tcW w:w="1170" w:type="dxa"/>
-            <w:shd w:val="clear" w:color="auto" w:fill="FFFFFF"/>
-            <w:tcMar>
-              <w:top w:w="100" w:type="dxa"/>
-              <w:left w:w="150" w:type="dxa"/>
-              <w:bottom w:w="100" w:type="dxa"/>
-              <w:right w:w="150" w:type="dxa"/>
-            </w:tcMar>
-            <w:vAlign w:val="center"/>
-          </w:tcPr>
-          <w:p>
-            <w:pPr>
-              <w:spacing w:before="40" w:after="40"/>
-            </w:pPr>
-            <w:r>
-              <w:rPr>
-                <w:sz w:val="20"/>
-              </w:rPr>
-              <w:t>C101</w:t>
-            </w:r>
-          </w:p>
-        </w:tc>
-        <w:tc>
-          <w:tcPr>
-            <w:tcW w:w="1170" w:type="dxa"/>
-            <w:shd w:val="clear" w:color="auto" w:fill="FFFFFF"/>
-            <w:tcMar>
-              <w:top w:w="100" w:type="dxa"/>
-              <w:left w:w="150" w:type="dxa"/>
-              <w:bottom w:w="100" w:type="dxa"/>
-              <w:right w:w="150" w:type="dxa"/>
-            </w:tcMar>
-            <w:vAlign w:val="center"/>
-          </w:tcPr>
-          <w:p>
-            <w:pPr>
-              <w:spacing w:before="40" w:after="40"/>
-            </w:pPr>
-            <w:r>
-              <w:rPr>
-                <w:sz w:val="20"/>
-              </w:rPr>
-              <w:t>P001</w:t>
-            </w:r>
-          </w:p>
-        </w:tc>
-        <w:tc>
-          <w:tcPr>
-            <w:tcW w:w="1170" w:type="dxa"/>
-            <w:shd w:val="clear" w:color="auto" w:fill="FFFFFF"/>
-            <w:tcMar>
-              <w:top w:w="100" w:type="dxa"/>
-              <w:left w:w="150" w:type="dxa"/>
-              <w:bottom w:w="100" w:type="dxa"/>
-              <w:right w:w="150" w:type="dxa"/>
-            </w:tcMar>
-            <w:vAlign w:val="center"/>
-          </w:tcPr>
-          <w:p>
-            <w:pPr>
-              <w:spacing w:before="40" w:after="40"/>
-            </w:pPr>
-            <w:r>
-              <w:rPr>
-                <w:sz w:val="20"/>
-              </w:rPr>
-              <w:t>2</w:t>
-            </w:r>
-          </w:p>
-        </w:tc>
-        <w:tc>
-          <w:tcPr>
-            <w:tcW w:w="1170" w:type="dxa"/>
-            <w:shd w:val="clear" w:color="auto" w:fill="FFFFFF"/>
-            <w:tcMar>
-              <w:top w:w="100" w:type="dxa"/>
-              <w:left w:w="150" w:type="dxa"/>
-              <w:bottom w:w="100" w:type="dxa"/>
-              <w:right w:w="150" w:type="dxa"/>
-            </w:tcMar>
-            <w:vAlign w:val="center"/>
-          </w:tcPr>
-          <w:p>
-            <w:pPr>
-              <w:spacing w:before="40" w:after="40"/>
-            </w:pPr>
-            <w:r>
-              <w:rPr>
-                <w:sz w:val="20"/>
-              </w:rPr>
-              <w:t>500</w:t>
-            </w:r>
-          </w:p>
-        </w:tc>
-        <w:tc>
-          <w:tcPr>
-            <w:tcW w:w="1170" w:type="dxa"/>
-            <w:shd w:val="clear" w:color="auto" w:fill="FFFFFF"/>
-            <w:tcMar>
-              <w:top w:w="100" w:type="dxa"/>
-              <w:left w:w="150" w:type="dxa"/>
-              <w:bottom w:w="100" w:type="dxa"/>
-              <w:right w:w="150" w:type="dxa"/>
-            </w:tcMar>
-            <w:vAlign w:val="center"/>
-          </w:tcPr>
-          <w:p>
-            <w:pPr>
-              <w:spacing w:before="40" w:after="40"/>
-            </w:pPr>
-            <w:r>
-              <w:rPr>
-                <w:sz w:val="20"/>
-              </w:rPr>
-              <w:t>2026-01-01</w:t>
-            </w:r>
-          </w:p>
-        </w:tc>
-        <w:tc>
-          <w:tcPr>
-            <w:tcW w:w="1170" w:type="dxa"/>
-            <w:shd w:val="clear" w:color="auto" w:fill="FFFFFF"/>
-            <w:tcMar>
-              <w:top w:w="100" w:type="dxa"/>
-              <w:left w:w="150" w:type="dxa"/>
-              <w:bottom w:w="100" w:type="dxa"/>
-              <w:right w:w="150" w:type="dxa"/>
-            </w:tcMar>
-            <w:vAlign w:val="center"/>
-          </w:tcPr>
-          <w:p>
-            <w:pPr>
-              <w:spacing w:before="40" w:after="40"/>
-            </w:pPr>
-            <w:r>
-              <w:rPr>
-                <w:sz w:val="20"/>
-              </w:rPr>
-              <w:t>USA</w:t>
-            </w:r>
-          </w:p>
-        </w:tc>
-        <w:tc>
-          <w:tcPr>
-            <w:tcW w:w="1170" w:type="dxa"/>
-            <w:shd w:val="clear" w:color="auto" w:fill="FFFFFF"/>
-            <w:tcMar>
-              <w:top w:w="100" w:type="dxa"/>
-              <w:left w:w="150" w:type="dxa"/>
-              <w:bottom w:w="100" w:type="dxa"/>
-              <w:right w:w="150" w:type="dxa"/>
-            </w:tcMar>
-            <w:vAlign w:val="center"/>
-          </w:tcPr>
-          <w:p>
-            <w:pPr>
-              <w:spacing w:before="40" w:after="40"/>
-            </w:pPr>
-            <w:r>
-              <w:rPr>
-                <w:sz w:val="20"/>
-              </w:rPr>
-              <w:t>Online</w:t>
-            </w:r>
-          </w:p>
-        </w:tc>
-      </w:tr>
-      <w:tr>
-        <w:trPr>
-          <w:jc w:val="center"/>
-        </w:trPr>
-        <w:tc>
-          <w:tcPr>
-            <w:tcW w:w="1170" w:type="dxa"/>
-            <w:shd w:val="clear" w:color="auto" w:fill="F7FAFC"/>
-            <w:tcMar>
-              <w:top w:w="100" w:type="dxa"/>
-              <w:left w:w="150" w:type="dxa"/>
-              <w:bottom w:w="100" w:type="dxa"/>
-              <w:right w:w="150" w:type="dxa"/>
-            </w:tcMar>
-            <w:vAlign w:val="center"/>
-          </w:tcPr>
-          <w:p>
-            <w:pPr>
-              <w:spacing w:before="40" w:after="40"/>
-            </w:pPr>
-            <w:r>
-              <w:rPr>
-                <w:sz w:val="20"/>
-              </w:rPr>
-              <w:t>1002</w:t>
-            </w:r>
-          </w:p>
-        </w:tc>
-        <w:tc>
-          <w:tcPr>
-            <w:tcW w:w="1170" w:type="dxa"/>
-            <w:shd w:val="clear" w:color="auto" w:fill="F7FAFC"/>
-            <w:tcMar>
-              <w:top w:w="100" w:type="dxa"/>
-              <w:left w:w="150" w:type="dxa"/>
-              <w:bottom w:w="100" w:type="dxa"/>
-              <w:right w:w="150" w:type="dxa"/>
-            </w:tcMar>
-            <w:vAlign w:val="center"/>
-          </w:tcPr>
-          <w:p>
-            <w:pPr>
-              <w:spacing w:before="40" w:after="40"/>
-            </w:pPr>
-            <w:r>
-              <w:rPr>
-                <w:sz w:val="20"/>
-              </w:rPr>
-              <w:t>C102</w:t>
-            </w:r>
-          </w:p>
-        </w:tc>
-        <w:tc>
-          <w:tcPr>
-            <w:tcW w:w="1170" w:type="dxa"/>
-            <w:shd w:val="clear" w:color="auto" w:fill="F7FAFC"/>
-            <w:tcMar>
-              <w:top w:w="100" w:type="dxa"/>
-              <w:left w:w="150" w:type="dxa"/>
-              <w:bottom w:w="100" w:type="dxa"/>
-              <w:right w:w="150" w:type="dxa"/>
-            </w:tcMar>
-            <w:vAlign w:val="center"/>
-          </w:tcPr>
-          <w:p>
-            <w:pPr>
-              <w:spacing w:before="40" w:after="40"/>
-            </w:pPr>
-            <w:r>
-              <w:rPr>
-                <w:sz w:val="20"/>
-              </w:rPr>
-              <w:t>P002</w:t>
-            </w:r>
-          </w:p>
-        </w:tc>
-        <w:tc>
-          <w:tcPr>
-            <w:tcW w:w="1170" w:type="dxa"/>
-            <w:shd w:val="clear" w:color="auto" w:fill="F7FAFC"/>
-            <w:tcMar>
-              <w:top w:w="100" w:type="dxa"/>
-              <w:left w:w="150" w:type="dxa"/>
-              <w:bottom w:w="100" w:type="dxa"/>
-              <w:right w:w="150" w:type="dxa"/>
-            </w:tcMar>
-            <w:vAlign w:val="center"/>
-          </w:tcPr>
-          <w:p>
-            <w:pPr>
-              <w:spacing w:before="40" w:after="40"/>
-            </w:pPr>
-            <w:r>
-              <w:rPr>
-                <w:sz w:val="20"/>
-              </w:rPr>
-              <w:t>1</w:t>
-            </w:r>
-          </w:p>
-        </w:tc>
-        <w:tc>
-          <w:tcPr>
-            <w:tcW w:w="1170" w:type="dxa"/>
-            <w:shd w:val="clear" w:color="auto" w:fill="F7FAFC"/>
-            <w:tcMar>
-              <w:top w:w="100" w:type="dxa"/>
-              <w:left w:w="150" w:type="dxa"/>
-              <w:bottom w:w="100" w:type="dxa"/>
-              <w:right w:w="150" w:type="dxa"/>
-            </w:tcMar>
-            <w:vAlign w:val="center"/>
-          </w:tcPr>
-          <w:p>
-            <w:pPr>
-              <w:spacing w:before="40" w:after="40"/>
-            </w:pPr>
-            <w:r>
-              <w:rPr>
-                <w:sz w:val="20"/>
-              </w:rPr>
-              <w:t>1200</w:t>
-            </w:r>
-          </w:p>
-        </w:tc>
-        <w:tc>
-          <w:tcPr>
-            <w:tcW w:w="1170" w:type="dxa"/>
-            <w:shd w:val="clear" w:color="auto" w:fill="F7FAFC"/>
-            <w:tcMar>
-              <w:top w:w="100" w:type="dxa"/>
-              <w:left w:w="150" w:type="dxa"/>
-              <w:bottom w:w="100" w:type="dxa"/>
-              <w:right w:w="150" w:type="dxa"/>
-            </w:tcMar>
-            <w:vAlign w:val="center"/>
-          </w:tcPr>
-          <w:p>
-            <w:pPr>
-              <w:spacing w:before="40" w:after="40"/>
-            </w:pPr>
-            <w:r>
-              <w:rPr>
-                <w:sz w:val="20"/>
-              </w:rPr>
-              <w:t>2026-01-02</w:t>
-            </w:r>
-          </w:p>
-        </w:tc>
-        <w:tc>
-          <w:tcPr>
-            <w:tcW w:w="1170" w:type="dxa"/>
-            <w:shd w:val="clear" w:color="auto" w:fill="F7FAFC"/>
-            <w:tcMar>
-              <w:top w:w="100" w:type="dxa"/>
-              <w:left w:w="150" w:type="dxa"/>
-              <w:bottom w:w="100" w:type="dxa"/>
-              <w:right w:w="150" w:type="dxa"/>
-            </w:tcMar>
-            <w:vAlign w:val="center"/>
-          </w:tcPr>
-          <w:p>
-            <w:pPr>
-              <w:spacing w:before="40" w:after="40"/>
-            </w:pPr>
-            <w:r>
-              <w:rPr>
-                <w:sz w:val="20"/>
-              </w:rPr>
-              <w:t>Canada</w:t>
-            </w:r>
-          </w:p>
-        </w:tc>
-        <w:tc>
-          <w:tcPr>
-            <w:tcW w:w="1170" w:type="dxa"/>
-            <w:shd w:val="clear" w:color="auto" w:fill="F7FAFC"/>
-            <w:tcMar>
-              <w:top w:w="100" w:type="dxa"/>
-              <w:left w:w="150" w:type="dxa"/>
-              <w:bottom w:w="100" w:type="dxa"/>
-              <w:right w:w="150" w:type="dxa"/>
-            </w:tcMar>
-            <w:vAlign w:val="center"/>
-          </w:tcPr>
-          <w:p>
-            <w:pPr>
-              <w:spacing w:before="40" w:after="40"/>
-            </w:pPr>
-            <w:r>
-              <w:rPr>
-                <w:sz w:val="20"/>
-              </w:rPr>
-              <w:t>Store</w:t>
-            </w:r>
-          </w:p>
-        </w:tc>
-      </w:tr>
-      <w:tr>
-        <w:trPr>
-          <w:jc w:val="center"/>
-        </w:trPr>
-        <w:tc>
-          <w:tcPr>
-            <w:tcW w:w="1170" w:type="dxa"/>
-            <w:shd w:val="clear" w:color="auto" w:fill="FFFFFF"/>
-            <w:tcMar>
-              <w:top w:w="100" w:type="dxa"/>
-              <w:left w:w="150" w:type="dxa"/>
-              <w:bottom w:w="100" w:type="dxa"/>
-              <w:right w:w="150" w:type="dxa"/>
-            </w:tcMar>
-            <w:vAlign w:val="center"/>
-          </w:tcPr>
-          <w:p>
-            <w:pPr>
-              <w:spacing w:before="40" w:after="40"/>
-            </w:pPr>
-            <w:r>
-              <w:rPr>
-                <w:sz w:val="20"/>
-              </w:rPr>
-              <w:t>1003</w:t>
-            </w:r>
-          </w:p>
-        </w:tc>
-        <w:tc>
-          <w:tcPr>
-            <w:tcW w:w="1170" w:type="dxa"/>
-            <w:shd w:val="clear" w:color="auto" w:fill="FFFFFF"/>
-            <w:tcMar>
-              <w:top w:w="100" w:type="dxa"/>
-              <w:left w:w="150" w:type="dxa"/>
-              <w:bottom w:w="100" w:type="dxa"/>
-              <w:right w:w="150" w:type="dxa"/>
-            </w:tcMar>
-            <w:vAlign w:val="center"/>
-          </w:tcPr>
-          <w:p>
-            <w:pPr>
-              <w:spacing w:before="40" w:after="40"/>
-            </w:pPr>
-          </w:p>
-        </w:tc>
-        <w:tc>
-          <w:tcPr>
-            <w:tcW w:w="1170" w:type="dxa"/>
-            <w:shd w:val="clear" w:color="auto" w:fill="FFFFFF"/>
-            <w:tcMar>
-              <w:top w:w="100" w:type="dxa"/>
-              <w:left w:w="150" w:type="dxa"/>
-              <w:bottom w:w="100" w:type="dxa"/>
-              <w:right w:w="150" w:type="dxa"/>
-            </w:tcMar>
-            <w:vAlign w:val="center"/>
-          </w:tcPr>
-          <w:p>
-            <w:pPr>
-              <w:spacing w:before="40" w:after="40"/>
-            </w:pPr>
-            <w:r>
-              <w:rPr>
-                <w:sz w:val="20"/>
-              </w:rPr>
-              <w:t>P003</w:t>
-            </w:r>
-          </w:p>
-        </w:tc>
-        <w:tc>
-          <w:tcPr>
-            <w:tcW w:w="1170" w:type="dxa"/>
-            <w:shd w:val="clear" w:color="auto" w:fill="FFFFFF"/>
-            <w:tcMar>
-              <w:top w:w="100" w:type="dxa"/>
-              <w:left w:w="150" w:type="dxa"/>
-              <w:bottom w:w="100" w:type="dxa"/>
-              <w:right w:w="150" w:type="dxa"/>
-            </w:tcMar>
-            <w:vAlign w:val="center"/>
-          </w:tcPr>
-          <w:p>
-            <w:pPr>
-              <w:spacing w:before="40" w:after="40"/>
-            </w:pPr>
-            <w:r>
-              <w:rPr>
-                <w:sz w:val="20"/>
-              </w:rPr>
-              <w:t>5</w:t>
-            </w:r>
-          </w:p>
-        </w:tc>
-        <w:tc>
-          <w:tcPr>
-            <w:tcW w:w="1170" w:type="dxa"/>
-            <w:shd w:val="clear" w:color="auto" w:fill="FFFFFF"/>
-            <w:tcMar>
-              <w:top w:w="100" w:type="dxa"/>
-              <w:left w:w="150" w:type="dxa"/>
-              <w:bottom w:w="100" w:type="dxa"/>
-              <w:right w:w="150" w:type="dxa"/>
-            </w:tcMar>
-            <w:vAlign w:val="center"/>
-          </w:tcPr>
-          <w:p>
-            <w:pPr>
-              <w:spacing w:before="40" w:after="40"/>
-            </w:pPr>
-            <w:r>
-              <w:rPr>
-                <w:sz w:val="20"/>
-              </w:rPr>
-              <w:t>50</w:t>
-            </w:r>
-          </w:p>
-        </w:tc>
-        <w:tc>
-          <w:tcPr>
-            <w:tcW w:w="1170" w:type="dxa"/>
-            <w:shd w:val="clear" w:color="auto" w:fill="FFFFFF"/>
-            <w:tcMar>
-              <w:top w:w="100" w:type="dxa"/>
-              <w:left w:w="150" w:type="dxa"/>
-              <w:bottom w:w="100" w:type="dxa"/>
-              <w:right w:w="150" w:type="dxa"/>
-            </w:tcMar>
-            <w:vAlign w:val="center"/>
-          </w:tcPr>
-          <w:p>
-            <w:pPr>
-              <w:spacing w:before="40" w:after="40"/>
-            </w:pPr>
-            <w:r>
-              <w:rPr>
-                <w:sz w:val="20"/>
-              </w:rPr>
-              <w:t>2026-01-03</w:t>
-            </w:r>
-          </w:p>
-        </w:tc>
-        <w:tc>
-          <w:tcPr>
-            <w:tcW w:w="1170" w:type="dxa"/>
-            <w:shd w:val="clear" w:color="auto" w:fill="FFFFFF"/>
-            <w:tcMar>
-              <w:top w:w="100" w:type="dxa"/>
-              <w:left w:w="150" w:type="dxa"/>
-              <w:bottom w:w="100" w:type="dxa"/>
-              <w:right w:w="150" w:type="dxa"/>
-            </w:tcMar>
-            <w:vAlign w:val="center"/>
-          </w:tcPr>
-          <w:p>
-            <w:pPr>
-              <w:spacing w:before="40" w:after="40"/>
-            </w:pPr>
-            <w:r>
-              <w:rPr>
-                <w:sz w:val="20"/>
-              </w:rPr>
-              <w:t>USA</w:t>
-            </w:r>
-          </w:p>
-        </w:tc>
-        <w:tc>
-          <w:tcPr>
-            <w:tcW w:w="1170" w:type="dxa"/>
-            <w:shd w:val="clear" w:color="auto" w:fill="FFFFFF"/>
-            <w:tcMar>
-              <w:top w:w="100" w:type="dxa"/>
-              <w:left w:w="150" w:type="dxa"/>
-              <w:bottom w:w="100" w:type="dxa"/>
-              <w:right w:w="150" w:type="dxa"/>
-            </w:tcMar>
-            <w:vAlign w:val="center"/>
-          </w:tcPr>
-          <w:p>
-            <w:pPr>
-              <w:spacing w:before="40" w:after="40"/>
-            </w:pPr>
-            <w:r>
-              <w:rPr>
-                <w:sz w:val="20"/>
-              </w:rPr>
-              <w:t>Online</w:t>
-            </w:r>
-          </w:p>
-        </w:tc>
-      </w:tr>
-      <w:tr>
-        <w:trPr>
-          <w:jc w:val="center"/>
-        </w:trPr>
-        <w:tc>
-          <w:tcPr>
-            <w:tcW w:w="1170" w:type="dxa"/>
-            <w:shd w:val="clear" w:color="auto" w:fill="F7FAFC"/>
-            <w:tcMar>
-              <w:top w:w="100" w:type="dxa"/>
-              <w:left w:w="150" w:type="dxa"/>
-              <w:bottom w:w="100" w:type="dxa"/>
-              <w:right w:w="150" w:type="dxa"/>
-            </w:tcMar>
-            <w:vAlign w:val="center"/>
-          </w:tcPr>
-          <w:p>
-            <w:pPr>
-              <w:spacing w:before="40" w:after="40"/>
-            </w:pPr>
-            <w:r>
-              <w:rPr>
-                <w:sz w:val="20"/>
-              </w:rPr>
-              <w:t>1004</w:t>
-            </w:r>
-          </w:p>
-        </w:tc>
-        <w:tc>
-          <w:tcPr>
-            <w:tcW w:w="1170" w:type="dxa"/>
-            <w:shd w:val="clear" w:color="auto" w:fill="F7FAFC"/>
-            <w:tcMar>
-              <w:top w:w="100" w:type="dxa"/>
-              <w:left w:w="150" w:type="dxa"/>
-              <w:bottom w:w="100" w:type="dxa"/>
-              <w:right w:w="150" w:type="dxa"/>
-            </w:tcMar>
-            <w:vAlign w:val="center"/>
-          </w:tcPr>
-          <w:p>
-            <w:pPr>
-              <w:spacing w:before="40" w:after="40"/>
-            </w:pPr>
-            <w:r>
-              <w:rPr>
-                <w:sz w:val="20"/>
-              </w:rPr>
-              <w:t>C104</w:t>
-            </w:r>
-          </w:p>
-        </w:tc>
-        <w:tc>
-          <w:tcPr>
-            <w:tcW w:w="1170" w:type="dxa"/>
-            <w:shd w:val="clear" w:color="auto" w:fill="F7FAFC"/>
-            <w:tcMar>
-              <w:top w:w="100" w:type="dxa"/>
-              <w:left w:w="150" w:type="dxa"/>
-              <w:bottom w:w="100" w:type="dxa"/>
-              <w:right w:w="150" w:type="dxa"/>
-            </w:tcMar>
-            <w:vAlign w:val="center"/>
-          </w:tcPr>
-          <w:p>
-            <w:pPr>
-              <w:spacing w:before="40" w:after="40"/>
-            </w:pPr>
-            <w:r>
-              <w:rPr>
-                <w:sz w:val="20"/>
-              </w:rPr>
-              <w:t>P004</w:t>
-            </w:r>
-          </w:p>
-        </w:tc>
-        <w:tc>
-          <w:tcPr>
-            <w:tcW w:w="1170" w:type="dxa"/>
-            <w:shd w:val="clear" w:color="auto" w:fill="F7FAFC"/>
-            <w:tcMar>
-              <w:top w:w="100" w:type="dxa"/>
-              <w:left w:w="150" w:type="dxa"/>
-              <w:bottom w:w="100" w:type="dxa"/>
-              <w:right w:w="150" w:type="dxa"/>
-            </w:tcMar>
-            <w:vAlign w:val="center"/>
-          </w:tcPr>
-          <w:p>
-            <w:pPr>
-              <w:spacing w:before="40" w:after="40"/>
-            </w:pPr>
-            <w:r>
-              <w:rPr>
-                <w:sz w:val="20"/>
-              </w:rPr>
-              <w:t>-1</w:t>
-            </w:r>
-          </w:p>
-        </w:tc>
-        <w:tc>
-          <w:tcPr>
-            <w:tcW w:w="1170" w:type="dxa"/>
-            <w:shd w:val="clear" w:color="auto" w:fill="F7FAFC"/>
-            <w:tcMar>
-              <w:top w:w="100" w:type="dxa"/>
-              <w:left w:w="150" w:type="dxa"/>
-              <w:bottom w:w="100" w:type="dxa"/>
-              <w:right w:w="150" w:type="dxa"/>
-            </w:tcMar>
-            <w:vAlign w:val="center"/>
-          </w:tcPr>
-          <w:p>
-            <w:pPr>
-              <w:spacing w:before="40" w:after="40"/>
-            </w:pPr>
-            <w:r>
-              <w:rPr>
-                <w:sz w:val="20"/>
-              </w:rPr>
-              <w:t>250</w:t>
-            </w:r>
-          </w:p>
-        </w:tc>
-        <w:tc>
-          <w:tcPr>
-            <w:tcW w:w="1170" w:type="dxa"/>
-            <w:shd w:val="clear" w:color="auto" w:fill="F7FAFC"/>
-            <w:tcMar>
-              <w:top w:w="100" w:type="dxa"/>
-              <w:left w:w="150" w:type="dxa"/>
-              <w:bottom w:w="100" w:type="dxa"/>
-              <w:right w:w="150" w:type="dxa"/>
-            </w:tcMar>
-            <w:vAlign w:val="center"/>
-          </w:tcPr>
-          <w:p>
-            <w:pPr>
-              <w:spacing w:before="40" w:after="40"/>
-            </w:pPr>
-            <w:r>
-              <w:rPr>
-                <w:sz w:val="20"/>
-              </w:rPr>
-              <w:t>2026-01-04</w:t>
-            </w:r>
-          </w:p>
-        </w:tc>
-        <w:tc>
-          <w:tcPr>
-            <w:tcW w:w="1170" w:type="dxa"/>
-            <w:shd w:val="clear" w:color="auto" w:fill="F7FAFC"/>
-            <w:tcMar>
-              <w:top w:w="100" w:type="dxa"/>
-              <w:left w:w="150" w:type="dxa"/>
-              <w:bottom w:w="100" w:type="dxa"/>
-              <w:right w:w="150" w:type="dxa"/>
-            </w:tcMar>
-            <w:vAlign w:val="center"/>
-          </w:tcPr>
-          <w:p>
-            <w:pPr>
-              <w:spacing w:before="40" w:after="40"/>
-            </w:pPr>
-            <w:r>
-              <w:rPr>
-                <w:sz w:val="20"/>
-              </w:rPr>
-              <w:t>UK</w:t>
-            </w:r>
-          </w:p>
-        </w:tc>
-        <w:tc>
-          <w:tcPr>
-            <w:tcW w:w="1170" w:type="dxa"/>
-            <w:shd w:val="clear" w:color="auto" w:fill="F7FAFC"/>
-            <w:tcMar>
-              <w:top w:w="100" w:type="dxa"/>
-              <w:left w:w="150" w:type="dxa"/>
-              <w:bottom w:w="100" w:type="dxa"/>
-              <w:right w:w="150" w:type="dxa"/>
-            </w:tcMar>
-            <w:vAlign w:val="center"/>
-          </w:tcPr>
-          <w:p>
-            <w:pPr>
-              <w:spacing w:before="40" w:after="40"/>
-            </w:pPr>
-            <w:r>
-              <w:rPr>
-                <w:sz w:val="20"/>
-              </w:rPr>
-              <w:t>Store</w:t>
-            </w:r>
-          </w:p>
-        </w:tc>
-      </w:tr>
-      <w:tr>
-        <w:trPr>
-          <w:jc w:val="center"/>
-        </w:trPr>
-        <w:tc>
-          <w:tcPr>
-            <w:tcW w:w="1170" w:type="dxa"/>
-            <w:shd w:val="clear" w:color="auto" w:fill="FFFFFF"/>
-            <w:tcMar>
-              <w:top w:w="100" w:type="dxa"/>
-              <w:left w:w="150" w:type="dxa"/>
-              <w:bottom w:w="100" w:type="dxa"/>
-              <w:right w:w="150" w:type="dxa"/>
-            </w:tcMar>
-            <w:vAlign w:val="center"/>
-          </w:tcPr>
-          <w:p>
-            <w:pPr>
-              <w:spacing w:before="40" w:after="40"/>
-            </w:pPr>
-            <w:r>
-              <w:rPr>
-                <w:sz w:val="20"/>
-              </w:rPr>
-              <w:t>1005</w:t>
-            </w:r>
-          </w:p>
-        </w:tc>
-        <w:tc>
-          <w:tcPr>
-            <w:tcW w:w="1170" w:type="dxa"/>
-            <w:shd w:val="clear" w:color="auto" w:fill="FFFFFF"/>
-            <w:tcMar>
-              <w:top w:w="100" w:type="dxa"/>
-              <w:left w:w="150" w:type="dxa"/>
-              <w:bottom w:w="100" w:type="dxa"/>
-              <w:right w:w="150" w:type="dxa"/>
-            </w:tcMar>
-            <w:vAlign w:val="center"/>
-          </w:tcPr>
-          <w:p>
-            <w:pPr>
-              <w:spacing w:before="40" w:after="40"/>
-            </w:pPr>
-            <w:r>
-              <w:rPr>
-                <w:sz w:val="20"/>
-              </w:rPr>
-              <w:t>C105</w:t>
-            </w:r>
-          </w:p>
-        </w:tc>
-        <w:tc>
-          <w:tcPr>
-            <w:tcW w:w="1170" w:type="dxa"/>
-            <w:shd w:val="clear" w:color="auto" w:fill="FFFFFF"/>
-            <w:tcMar>
-              <w:top w:w="100" w:type="dxa"/>
-              <w:left w:w="150" w:type="dxa"/>
-              <w:bottom w:w="100" w:type="dxa"/>
-              <w:right w:w="150" w:type="dxa"/>
-            </w:tcMar>
-            <w:vAlign w:val="center"/>
-          </w:tcPr>
-          <w:p>
-            <w:pPr>
-              <w:spacing w:before="40" w:after="40"/>
-            </w:pPr>
-            <w:r>
-              <w:rPr>
-                <w:sz w:val="20"/>
-              </w:rPr>
-              <w:t>P005</w:t>
-            </w:r>
-          </w:p>
-        </w:tc>
-        <w:tc>
-          <w:tcPr>
-            <w:tcW w:w="1170" w:type="dxa"/>
-            <w:shd w:val="clear" w:color="auto" w:fill="FFFFFF"/>
-            <w:tcMar>
-              <w:top w:w="100" w:type="dxa"/>
-              <w:left w:w="150" w:type="dxa"/>
-              <w:bottom w:w="100" w:type="dxa"/>
-              <w:right w:w="150" w:type="dxa"/>
-            </w:tcMar>
-            <w:vAlign w:val="center"/>
-          </w:tcPr>
-          <w:p>
-            <w:pPr>
-              <w:spacing w:before="40" w:after="40"/>
-            </w:pPr>
-            <w:r>
-              <w:rPr>
-                <w:sz w:val="20"/>
-              </w:rPr>
-              <w:t>3</w:t>
-            </w:r>
-          </w:p>
-        </w:tc>
-        <w:tc>
-          <w:tcPr>
-            <w:tcW w:w="1170" w:type="dxa"/>
-            <w:shd w:val="clear" w:color="auto" w:fill="FFFFFF"/>
-            <w:tcMar>
-              <w:top w:w="100" w:type="dxa"/>
-              <w:left w:w="150" w:type="dxa"/>
-              <w:bottom w:w="100" w:type="dxa"/>
-              <w:right w:w="150" w:type="dxa"/>
-            </w:tcMar>
-            <w:vAlign w:val="center"/>
-          </w:tcPr>
-          <w:p>
-            <w:pPr>
-              <w:spacing w:before="40" w:after="40"/>
-            </w:pPr>
-            <w:r>
-              <w:rPr>
-                <w:sz w:val="20"/>
-              </w:rPr>
-              <w:t>400</w:t>
-            </w:r>
-          </w:p>
-        </w:tc>
-        <w:tc>
-          <w:tcPr>
-            <w:tcW w:w="1170" w:type="dxa"/>
-            <w:shd w:val="clear" w:color="auto" w:fill="FFFFFF"/>
-            <w:tcMar>
-              <w:top w:w="100" w:type="dxa"/>
-              <w:left w:w="150" w:type="dxa"/>
-              <w:bottom w:w="100" w:type="dxa"/>
-              <w:right w:w="150" w:type="dxa"/>
-            </w:tcMar>
-            <w:vAlign w:val="center"/>
-          </w:tcPr>
-          <w:p>
-            <w:pPr>
-              <w:spacing w:before="40" w:after="40"/>
-            </w:pPr>
-            <w:r>
-              <w:rPr>
-                <w:sz w:val="20"/>
-              </w:rPr>
-              <w:t>2026-01-05</w:t>
-            </w:r>
-          </w:p>
-        </w:tc>
-        <w:tc>
-          <w:tcPr>
-            <w:tcW w:w="1170" w:type="dxa"/>
-            <w:shd w:val="clear" w:color="auto" w:fill="FFFFFF"/>
-            <w:tcMar>
-              <w:top w:w="100" w:type="dxa"/>
-              <w:left w:w="150" w:type="dxa"/>
-              <w:bottom w:w="100" w:type="dxa"/>
-              <w:right w:w="150" w:type="dxa"/>
-            </w:tcMar>
-            <w:vAlign w:val="center"/>
-          </w:tcPr>
-          <w:p>
-            <w:pPr>
-              <w:spacing w:before="40" w:after="40"/>
-            </w:pPr>
-            <w:r>
-              <w:rPr>
-                <w:sz w:val="20"/>
-              </w:rPr>
-              <w:t>India</w:t>
-            </w:r>
-          </w:p>
-        </w:tc>
-        <w:tc>
-          <w:tcPr>
-            <w:tcW w:w="1170" w:type="dxa"/>
-            <w:shd w:val="clear" w:color="auto" w:fill="FFFFFF"/>
-            <w:tcMar>
-              <w:top w:w="100" w:type="dxa"/>
-              <w:left w:w="150" w:type="dxa"/>
-              <w:bottom w:w="100" w:type="dxa"/>
-              <w:right w:w="150" w:type="dxa"/>
-            </w:tcMar>
-            <w:vAlign w:val="center"/>
-          </w:tcPr>
-          <w:p>
-            <w:pPr>
-              <w:spacing w:before="40" w:after="40"/>
-            </w:pPr>
-            <w:r>
-              <w:rPr>
-                <w:sz w:val="20"/>
-              </w:rPr>
-              <w:t>Online</w:t>
-            </w:r>
-          </w:p>
-        </w:tc>
-      </w:tr>
-      <w:tr>
-        <w:trPr>
-          <w:jc w:val="center"/>
-        </w:trPr>
-        <w:tc>
-          <w:tcPr>
-            <w:tcW w:w="1170" w:type="dxa"/>
-            <w:shd w:val="clear" w:color="auto" w:fill="F7FAFC"/>
-            <w:tcMar>
-              <w:top w:w="100" w:type="dxa"/>
-              <w:left w:w="150" w:type="dxa"/>
-              <w:bottom w:w="100" w:type="dxa"/>
-              <w:right w:w="150" w:type="dxa"/>
-            </w:tcMar>
-            <w:vAlign w:val="center"/>
-          </w:tcPr>
-          <w:p>
-            <w:pPr>
-              <w:spacing w:before="40" w:after="40"/>
-            </w:pPr>
-            <w:r>
-              <w:rPr>
-                <w:sz w:val="20"/>
-              </w:rPr>
-              <w:t>1005</w:t>
-            </w:r>
-          </w:p>
-        </w:tc>
-        <w:tc>
-          <w:tcPr>
-            <w:tcW w:w="1170" w:type="dxa"/>
-            <w:shd w:val="clear" w:color="auto" w:fill="F7FAFC"/>
-            <w:tcMar>
-              <w:top w:w="100" w:type="dxa"/>
-              <w:left w:w="150" w:type="dxa"/>
-              <w:bottom w:w="100" w:type="dxa"/>
-              <w:right w:w="150" w:type="dxa"/>
-            </w:tcMar>
-            <w:vAlign w:val="center"/>
-          </w:tcPr>
-          <w:p>
-            <w:pPr>
-              <w:spacing w:before="40" w:after="40"/>
-            </w:pPr>
-            <w:r>
-              <w:rPr>
-                <w:sz w:val="20"/>
-              </w:rPr>
-              <w:t>C105</w:t>
-            </w:r>
-          </w:p>
-        </w:tc>
-        <w:tc>
-          <w:tcPr>
-            <w:tcW w:w="1170" w:type="dxa"/>
-            <w:shd w:val="clear" w:color="auto" w:fill="F7FAFC"/>
-            <w:tcMar>
-              <w:top w:w="100" w:type="dxa"/>
-              <w:left w:w="150" w:type="dxa"/>
-              <w:bottom w:w="100" w:type="dxa"/>
-              <w:right w:w="150" w:type="dxa"/>
-            </w:tcMar>
-            <w:vAlign w:val="center"/>
-          </w:tcPr>
-          <w:p>
-            <w:pPr>
-              <w:spacing w:before="40" w:after="40"/>
-            </w:pPr>
-            <w:r>
-              <w:rPr>
-                <w:sz w:val="20"/>
-              </w:rPr>
-              <w:t>P005</w:t>
-            </w:r>
-          </w:p>
-        </w:tc>
-        <w:tc>
-          <w:tcPr>
-            <w:tcW w:w="1170" w:type="dxa"/>
-            <w:shd w:val="clear" w:color="auto" w:fill="F7FAFC"/>
-            <w:tcMar>
-              <w:top w:w="100" w:type="dxa"/>
-              <w:left w:w="150" w:type="dxa"/>
-              <w:bottom w:w="100" w:type="dxa"/>
-              <w:right w:w="150" w:type="dxa"/>
-            </w:tcMar>
-            <w:vAlign w:val="center"/>
-          </w:tcPr>
-          <w:p>
-            <w:pPr>
-              <w:spacing w:before="40" w:after="40"/>
-            </w:pPr>
-            <w:r>
-              <w:rPr>
-                <w:sz w:val="20"/>
-              </w:rPr>
-              <w:t>3</w:t>
-            </w:r>
-          </w:p>
-        </w:tc>
-        <w:tc>
-          <w:tcPr>
-            <w:tcW w:w="1170" w:type="dxa"/>
-            <w:shd w:val="clear" w:color="auto" w:fill="F7FAFC"/>
-            <w:tcMar>
-              <w:top w:w="100" w:type="dxa"/>
-              <w:left w:w="150" w:type="dxa"/>
-              <w:bottom w:w="100" w:type="dxa"/>
-              <w:right w:w="150" w:type="dxa"/>
-            </w:tcMar>
-            <w:vAlign w:val="center"/>
-          </w:tcPr>
-          <w:p>
-            <w:pPr>
-              <w:spacing w:before="40" w:after="40"/>
-            </w:pPr>
-            <w:r>
-              <w:rPr>
-                <w:sz w:val="20"/>
-              </w:rPr>
-              <w:t>400</w:t>
-            </w:r>
-          </w:p>
-        </w:tc>
-        <w:tc>
-          <w:tcPr>
-            <w:tcW w:w="1170" w:type="dxa"/>
-            <w:shd w:val="clear" w:color="auto" w:fill="F7FAFC"/>
-            <w:tcMar>
-              <w:top w:w="100" w:type="dxa"/>
-              <w:left w:w="150" w:type="dxa"/>
-              <w:bottom w:w="100" w:type="dxa"/>
-              <w:right w:w="150" w:type="dxa"/>
-            </w:tcMar>
-            <w:vAlign w:val="center"/>
-          </w:tcPr>
-          <w:p>
-            <w:pPr>
-              <w:spacing w:before="40" w:after="40"/>
-            </w:pPr>
-            <w:r>
-              <w:rPr>
-                <w:sz w:val="20"/>
-              </w:rPr>
-              <w:t>2026-01-05</w:t>
-            </w:r>
-          </w:p>
-        </w:tc>
-        <w:tc>
-          <w:tcPr>
-            <w:tcW w:w="1170" w:type="dxa"/>
-            <w:shd w:val="clear" w:color="auto" w:fill="F7FAFC"/>
-            <w:tcMar>
-              <w:top w:w="100" w:type="dxa"/>
-              <w:left w:w="150" w:type="dxa"/>
-              <w:bottom w:w="100" w:type="dxa"/>
-              <w:right w:w="150" w:type="dxa"/>
-            </w:tcMar>
-            <w:vAlign w:val="center"/>
-          </w:tcPr>
-          <w:p>
-            <w:pPr>
-              <w:spacing w:before="40" w:after="40"/>
-            </w:pPr>
-            <w:r>
-              <w:rPr>
-                <w:sz w:val="20"/>
-              </w:rPr>
-              <w:t>India</w:t>
-            </w:r>
-          </w:p>
-        </w:tc>
-        <w:tc>
-          <w:tcPr>
-            <w:tcW w:w="1170" w:type="dxa"/>
-            <w:shd w:val="clear" w:color="auto" w:fill="F7FAFC"/>
-            <w:tcMar>
-              <w:top w:w="100" w:type="dxa"/>
-              <w:left w:w="150" w:type="dxa"/>
-              <w:bottom w:w="100" w:type="dxa"/>
-              <w:right w:w="150" w:type="dxa"/>
-            </w:tcMar>
-            <w:vAlign w:val="center"/>
-          </w:tcPr>
-          <w:p>
-            <w:pPr>
-              <w:spacing w:before="40" w:after="40"/>
-            </w:pPr>
-            <w:r>
-              <w:rPr>
-                <w:sz w:val="20"/>
-              </w:rPr>
-              <w:t>Online</w:t>
-            </w:r>
-          </w:p>
-        </w:tc>
-      </w:tr>
-    </w:tbl>
-    <w:p>
-      <w:pPr>
-        <w:spacing w:after="120"/>
-      </w:pPr>
-    </w:p>
-    <w:p>
-      <w:pPr>
-        <w:keepNext/>
-        <w:pBdr>
-          <w:bottom w:val="single" w:sz="6" w:space="1" w:color="2B6CAC"/>
-        </w:pBdr>
-        <w:spacing w:before="360" w:after="120"/>
-      </w:pPr>
-      <w:r>
-        <w:rPr>
-          <w:b/>
-          <w:color w:val="1A365D"/>
-          <w:sz w:val="28"/>
-        </w:rPr>
-        <w:t>6. Linked Services Configuration</w:t>
-      </w:r>
-    </w:p>
-    <w:p>
-      <w:pPr>
-        <w:keepNext/>
-        <w:spacing w:before="240" w:after="80"/>
-      </w:pPr>
-      <w:r>
-        <w:rPr>
-          <w:b/>
-          <w:color w:val="2B6CAC"/>
-          <w:sz w:val="24"/>
-        </w:rPr>
-        <w:t>AWS S3 Linked Service</w:t>
-      </w:r>
-    </w:p>
-    <w:p>
-      <w:pPr>
-        <w:spacing w:after="80"/>
-      </w:pPr>
-      <w:r>
-        <w:t>Authentication: Access Key</w:t>
-      </w:r>
-    </w:p>
-    <w:p>
-      <w:pPr>
-        <w:spacing w:after="80"/>
-      </w:pPr>
-      <w:r>
-        <w:t>Secret Key</w:t>
-      </w:r>
-    </w:p>
-    <w:p>
-      <w:pPr>
-        <w:spacing w:after="80"/>
-      </w:pPr>
-      <w:r>
-        <w:t>Bucket: retail-sales-data</w:t>
-      </w:r>
-    </w:p>
-    <w:p>
-      <w:pPr>
-        <w:keepNext/>
-        <w:spacing w:before="240" w:after="80"/>
-      </w:pPr>
-      <w:r>
-        <w:rPr>
-          <w:b/>
-          <w:color w:val="2B6CAC"/>
-          <w:sz w:val="24"/>
-        </w:rPr>
-        <w:lastRenderedPageBreak/>
-        <w:t>ADLS Linked Service</w:t>
-      </w:r>
-    </w:p>
-    <w:p>
-      <w:pPr>
-        <w:spacing w:after="80"/>
-      </w:pPr>
-      <w:r>
-        <w:t>Authentication: Managed Identity</w:t>
-      </w:r>
-    </w:p>
-    <w:p>
-      <w:pPr>
-        <w:keepNext/>
-        <w:spacing w:before="240" w:after="80"/>
-      </w:pPr>
-      <w:r>
-        <w:rPr>
-          <w:b/>
-          <w:color w:val="2B6CAC"/>
-          <w:sz w:val="24"/>
-        </w:rPr>
-        <w:t>Azure SQL Linked Service</w:t>
-      </w:r>
-    </w:p>
-    <w:p>
-      <w:pPr>
-        <w:spacing w:after="80"/>
-      </w:pPr>
-      <w:r>
-        <w:t>Authentication: SQL Authentication</w:t>
-      </w:r>
-    </w:p>
-    <w:p>
-      <w:pPr>
-        <w:keepNext/>
-        <w:spacing w:before="240" w:after="80"/>
-      </w:pPr>
-      <w:r>
-        <w:rPr>
-          <w:b/>
-          <w:color w:val="2B6CAC"/>
-          <w:sz w:val="24"/>
-        </w:rPr>
-        <w:t>Azure Key Vault Linked Service</w:t>
-      </w:r>
-    </w:p>
-    <w:p>
-      <w:pPr>
-        <w:spacing w:after="80"/>
-      </w:pPr>
-      <w:r>
-        <w:t>Authentication: Managed Identity</w:t>
-      </w:r>
-    </w:p>
-    <w:p>
-      <w:pPr>
-        <w:keepNext/>
-        <w:pBdr>
-          <w:bottom w:val="single" w:sz="6" w:space="1" w:color="2B6CAC"/>
-        </w:pBdr>
-        <w:spacing w:before="360" w:after="120"/>
-      </w:pPr>
-      <w:r>
-        <w:rPr>
-          <w:b/>
-          <w:color w:val="1A365D"/>
-          <w:sz w:val="28"/>
-        </w:rPr>
-        <w:t>7. Data Migration Pipeline</w:t>
-      </w:r>
-    </w:p>
-    <w:p>
-      <w:pPr>
-        <w:spacing w:after="80"/>
-      </w:pPr>
-      <w:r>
-        <w:t>Pipeline Name: PL_S3_To_ADLS</w:t>
-      </w:r>
-    </w:p>
-    <w:p>
-      <w:pPr>
-        <w:spacing w:after="80"/>
-      </w:pPr>
-      <w:r>
-        <w:t>Purpose: Move CSV files from AWS S3 into ADLS Raw Zone.</w:t>
-      </w:r>
-    </w:p>
-    <w:p>
-      <w:pPr>
-        <w:spacing w:after="80"/>
-      </w:pPr>
-      <w:r>
-        <w:t>Activities:</w:t>
-      </w:r>
-    </w:p>
-    <w:p>
-      <w:pPr>
-        <w:pStyle w:val="ListBullet"/>
-        <w:spacing w:after="60"/>
-      </w:pPr>
-      <w:r>
-        <w:t>Get Metadata</w:t>
-      </w:r>
-    </w:p>
-    <w:p>
-      <w:pPr>
-        <w:pStyle w:val="ListBullet"/>
-        <w:spacing w:after="60"/>
-      </w:pPr>
-      <w:r>
-        <w:t>Validation</w:t>
-      </w:r>
-    </w:p>
-    <w:p>
-      <w:pPr>
-        <w:pStyle w:val="ListBullet"/>
-        <w:spacing w:after="60"/>
-      </w:pPr>
-      <w:r>
-        <w:t>Copy Activity</w:t>
-      </w:r>
-    </w:p>
-    <w:p>
-      <w:pPr>
-        <w:pStyle w:val="ListBullet"/>
-        <w:spacing w:after="60"/>
-      </w:pPr>
-      <w:r>
-        <w:t>Logging</w:t>
-      </w:r>
-    </w:p>
-    <w:p>
-      <w:pPr>
-        <w:pStyle w:val="ListBullet"/>
-        <w:spacing w:after="60"/>
-      </w:pPr>
-      <w:r>
-        <w:t>Error Handling</w:t>
-      </w:r>
-    </w:p>
-    <w:p>
-      <w:pPr>
-        <w:keepNext/>
-        <w:spacing w:before="240" w:after="80"/>
-      </w:pPr>
-      <w:r>
-        <w:rPr>
-          <w:b/>
-          <w:color w:val="2B6CAC"/>
-          <w:sz w:val="24"/>
-        </w:rPr>
-        <w:t>Pipeline Flow:</w:t>
-      </w:r>
-    </w:p>
-    <w:tbl>
-      <w:tblPr>
-        <w:tblW w:w="0" w:type="auto"/>
-        <w:jc w:val="center"/>
-        <w:tblLayout w:type="fixed"/>
-        <w:tblLook w:val="04A0" w:firstRow="1" w:lastRow="0" w:firstColumn="1" w:lastColumn="0" w:noHBand="0" w:noVBand="1"/>
-      </w:tblPr>
-      <w:tblGrid>
-        <w:gridCol w:w="9360"/>
-      </w:tblGrid>
-      <w:tr>
-        <w:trPr>
-          <w:jc w:val="center"/>
-        </w:trPr>
-        <w:tc>
-          <w:tcPr>
-            <w:tcW w:w="9360" w:type="dxa"/>
-            <w:tcBorders>
-              <w:left w:val="single" w:sz="24" w:space="0" w:color="2B6CAC"/>
-            </w:tcBorders>
-            <w:shd w:val="clear" w:color="auto" w:fill="F7FAFC"/>
-            <w:tcMar>
-              <w:top w:w="140" w:type="dxa"/>
-              <w:left w:w="200" w:type="dxa"/>
-              <w:bottom w:w="140" w:type="dxa"/>
-              <w:right w:w="200" w:type="dxa"/>
-            </w:tcMar>
-          </w:tcPr>
-          <w:p>
-            <w:pPr>
-              <w:spacing w:after="80"/>
-            </w:pPr>
-            <w:r>
-              <w:rPr>
-                <w:sz w:val="21"/>
-              </w:rPr>
-              <w:t>S3 Source</w:t>
-            </w:r>
-          </w:p>
-          <w:p>
-            <w:pPr>
-              <w:spacing w:after="80"/>
-            </w:pPr>
-            <w:r>
-              <w:rPr>
-                <w:sz w:val="21"/>
-              </w:rPr>
-              <w:t xml:space="preserve">   ↓</w:t>
-            </w:r>
-          </w:p>
-          <w:p>
-            <w:pPr>
-              <w:spacing w:after="80"/>
-            </w:pPr>
-            <w:r>
-              <w:rPr>
-                <w:sz w:val="21"/>
-              </w:rPr>
-              <w:t>Copy Activity</w:t>
-            </w:r>
-          </w:p>
-          <w:p>
-            <w:pPr>
-              <w:spacing w:after="80"/>
-            </w:pPr>
-            <w:r>
-              <w:rPr>
-                <w:sz w:val="21"/>
-              </w:rPr>
-              <w:t xml:space="preserve">   ↓</w:t>
-            </w:r>
-          </w:p>
-          <w:p>
-            <w:pPr>
-              <w:spacing w:after="80"/>
-            </w:pPr>
-            <w:r>
-              <w:rPr>
-                <w:sz w:val="21"/>
-              </w:rPr>
-              <w:t>ADLS Raw Zone</w:t>
-            </w:r>
-          </w:p>
-        </w:tc>
-      </w:tr>
-    </w:tbl>
-    <w:p>
-      <w:pPr>
-        <w:keepNext/>
-        <w:pBdr>
-          <w:bottom w:val="single" w:sz="6" w:space="1" w:color="2B6CAC"/>
-        </w:pBdr>
-        <w:spacing w:before="360" w:after="120"/>
-      </w:pPr>
-      <w:r>
-        <w:rPr>
-          <w:b/>
-          <w:color w:val="1A365D"/>
-          <w:sz w:val="28"/>
-        </w:rPr>
-        <w:t>8. Create Datasets in ADF</w:t>
-      </w:r>
-    </w:p>
-    <w:p>
-      <w:pPr>
-        <w:spacing w:after="80"/>
-      </w:pPr>
-      <w:r>
-        <w:t>Dataset Name: DS_S3_Sales_CSV</w:t>
-      </w:r>
-    </w:p>
-    <w:p>
-      <w:pPr>
-        <w:spacing w:after="80"/>
-      </w:pPr>
-      <w:r>
-        <w:t>Format: Delimited Text</w:t>
-      </w:r>
-    </w:p>
-    <w:p>
-      <w:pPr>
-        <w:spacing w:after="40"/>
-      </w:pPr>
-    </w:p>
-    <w:p>
-      <w:pPr>
-        <w:spacing w:after="80"/>
-      </w:pPr>
-      <w:r>
-        <w:t>Dataset Name: DS_ADLS_Raw_Sales</w:t>
-      </w:r>
-    </w:p>
-    <w:p>
-      <w:pPr>
-        <w:spacing w:after="80"/>
-      </w:pPr>
-      <w:r>
-        <w:t>Format: CSV</w:t>
-      </w:r>
-    </w:p>
-    <w:p>
-      <w:pPr>
-        <w:spacing w:after="40"/>
-      </w:pPr>
-    </w:p>
-    <w:p>
-      <w:pPr>
-        <w:spacing w:after="80"/>
-      </w:pPr>
-      <w:r>
-        <w:t>Dataset Name: DS_ADLS_Parquet</w:t>
-      </w:r>
-    </w:p>
-    <w:p>
-      <w:pPr>
-        <w:spacing w:after="80"/>
-      </w:pPr>
-      <w:r>
-        <w:lastRenderedPageBreak/>
-        <w:t>Format: Parquet</w:t>
-      </w:r>
-    </w:p>
-    <w:p>
-      <w:pPr>
-        <w:spacing w:after="40"/>
-      </w:pPr>
-    </w:p>
-    <w:p>
-      <w:pPr>
-        <w:spacing w:after="80"/>
-      </w:pPr>
-      <w:r>
-        <w:t>Dataset Name: DS_SQL_SalesFact</w:t>
-      </w:r>
-    </w:p>
-    <w:p>
-      <w:pPr>
-        <w:spacing w:after="80"/>
-      </w:pPr>
-      <w:r>
-        <w:t>Format: Azure SQL Table</w:t>
-      </w:r>
-    </w:p>
-    <w:p>
-      <w:pPr>
-        <w:spacing w:after="40"/>
-      </w:pPr>
-    </w:p>
-    <w:p>
-      <w:pPr>
-        <w:keepNext/>
-        <w:pBdr>
-          <w:bottom w:val="single" w:sz="6" w:space="1" w:color="2B6CAC"/>
-        </w:pBdr>
-        <w:spacing w:before="360" w:after="120"/>
-      </w:pPr>
-      <w:r>
-        <w:rPr>
-          <w:b/>
-          <w:color w:val="1A365D"/>
-          <w:sz w:val="28"/>
-        </w:rPr>
-        <w:t>9. Data Transformation Requirements</w:t>
-      </w:r>
-    </w:p>
-    <w:p>
-      <w:pPr>
-        <w:spacing w:after="80"/>
-      </w:pPr>
-      <w:r>
-        <w:t>Pipeline Name: PL_Sales_Transformation</w:t>
-      </w:r>
-    </w:p>
-    <w:p>
-      <w:pPr>
-        <w:spacing w:after="80"/>
-      </w:pPr>
-      <w:r>
-        <w:rPr>
-          <w:b/>
-          <w:noProof/>
-          <w:color w:val="1A365D"/>
-          <w:sz w:val="28"/>
-        </w:rPr>
         <w:drawing>
-          <wp:inline distT="0" distB="0" distL="0" distR="0" wp14:anchorId="3DCA3CE0" wp14:editId="128E3EB6">
-            <wp:extent cx="4480560" cy="2561004"/>
-            <wp:effectExtent l="0" t="0" r="0" b="0"/>
-            <wp:docPr id="1565157700" name="Picture 1"/>
+          <wp:inline distT="0" distB="0" distL="0" distR="0" wp14:anchorId="146DE1F6" wp14:editId="58A28FF0">
+            <wp:extent cx="5943600" cy="3382645"/>
+            <wp:effectExtent l="0" t="0" r="0" b="8255"/>
+            <wp:docPr id="323057304" name="Picture 1"/>
             <wp:cNvGraphicFramePr>
               <a:graphicFrameLocks xmlns:a="http://schemas.openxmlformats.org/drawingml/2006/main" noChangeAspect="1"/>
             </wp:cNvGraphicFramePr>
@@ -2951,7 +563,7 @@
               <a:graphicData uri="http://schemas.openxmlformats.org/drawingml/2006/picture">
                 <pic:pic xmlns:pic="http://schemas.openxmlformats.org/drawingml/2006/picture">
                   <pic:nvPicPr>
-                    <pic:cNvPr id="1565157700" name=""/>
+                    <pic:cNvPr id="323057304" name=""/>
                     <pic:cNvPicPr/>
                   </pic:nvPicPr>
                   <pic:blipFill>
@@ -2963,7 +575,7 @@
                   <pic:spPr>
                     <a:xfrm>
                       <a:off x="0" y="0"/>
-                      <a:ext cx="4484549" cy="2563284"/>
+                      <a:ext cx="5943600" cy="3382645"/>
                     </a:xfrm>
                     <a:prstGeom prst="rect">
                       <a:avLst/>
@@ -2978,25 +590,132 @@
     </w:p>
     <w:p>
       <w:pPr>
-        <w:spacing w:after="80"/>
+        <w:keepNext/>
+        <w:spacing w:before="240" w:after="80"/>
+      </w:pPr>
+    </w:p>
+    <w:p>
+      <w:pPr>
+        <w:keepNext/>
+        <w:pBdr>
+          <w:bottom w:val="single" w:sz="6" w:space="1" w:color="2B6CAC"/>
+        </w:pBdr>
+        <w:spacing w:before="360" w:after="120"/>
       </w:pPr>
       <w:r>
-        <w:t>Data Flow Name: DF_Sales_Cleansing</w:t>
+        <w:rPr>
+          <w:b/>
+          <w:color w:val="1A365D"/>
+          <w:sz w:val="28"/>
+        </w:rPr>
+        <w:t>4. Create Source Datasets</w:t>
       </w:r>
     </w:p>
     <w:p>
       <w:pPr>
-        <w:spacing w:after="80"/>
+        <w:pStyle w:val="ListBullet"/>
+        <w:numPr>
+          <w:ilvl w:val="0"/>
+          <w:numId w:val="0"/>
+        </w:numPr>
+        <w:spacing w:after="60"/>
+        <w:ind w:left="360" w:hanging="360"/>
+      </w:pPr>
+      <w:r>
+        <w:t>Created 3 files, sales_data.csv, customer</w:t>
+      </w:r>
+      <w:r>
+        <w:t>s</w:t>
+      </w:r>
+      <w:r>
+        <w:t xml:space="preserve">_data.csv &amp; </w:t>
+      </w:r>
+      <w:r>
+        <w:t>products_data.csv</w:t>
+      </w:r>
+      <w:r>
+        <w:t xml:space="preserve">. dummy data, </w:t>
+      </w:r>
+      <w:r>
+        <w:t>added few error</w:t>
+      </w:r>
+      <w:r>
+        <w:t>…</w:t>
+      </w:r>
+    </w:p>
+    <w:p>
+      <w:pPr>
+        <w:keepNext/>
+        <w:pBdr>
+          <w:bottom w:val="single" w:sz="6" w:space="1" w:color="2B6CAC"/>
+        </w:pBdr>
+        <w:spacing w:before="360" w:after="120"/>
       </w:pPr>
       <w:r>
         <w:rPr>
-          <w:noProof/>
+          <w:b/>
+          <w:color w:val="1A365D"/>
+          <w:sz w:val="28"/>
         </w:rPr>
+        <w:t>5. Sample Sales Data</w:t>
+      </w:r>
+    </w:p>
+    <w:p>
+      <w:pPr>
+        <w:keepNext/>
+        <w:spacing w:before="240" w:after="80"/>
+      </w:pPr>
+      <w:r>
+        <w:rPr>
+          <w:b/>
+          <w:color w:val="2B6CAC"/>
+          <w:sz w:val="24"/>
+        </w:rPr>
+        <w:t>s</w:t>
+      </w:r>
+      <w:r>
+        <w:rPr>
+          <w:b/>
+          <w:color w:val="2B6CAC"/>
+          <w:sz w:val="24"/>
+        </w:rPr>
+        <w:t>ales_data.csv</w:t>
+      </w:r>
+    </w:p>
+    <w:p>
+      <w:pPr>
+        <w:spacing w:after="120"/>
+      </w:pPr>
+    </w:p>
+    <w:p>
+      <w:pPr>
+        <w:keepNext/>
+        <w:pBdr>
+          <w:bottom w:val="single" w:sz="6" w:space="1" w:color="2B6CAC"/>
+        </w:pBdr>
+        <w:spacing w:before="360" w:after="120"/>
+      </w:pPr>
+      <w:r>
+        <w:rPr>
+          <w:b/>
+          <w:color w:val="1A365D"/>
+          <w:sz w:val="28"/>
+        </w:rPr>
+        <w:lastRenderedPageBreak/>
+        <w:t>6. Linked Services Configuration</w:t>
+      </w:r>
+    </w:p>
+    <w:p>
+      <w:pPr>
+        <w:keepNext/>
+        <w:spacing w:before="240" w:after="80"/>
+      </w:pPr>
+      <w:r>
         <w:drawing>
-          <wp:inline distT="0" distB="0" distL="0" distR="0" wp14:anchorId="5E7E5FE1" wp14:editId="1318875F">
-            <wp:extent cx="5943600" cy="1581785"/>
-            <wp:effectExtent l="0" t="0" r="0" b="0"/>
-            <wp:docPr id="2045849231" name="Picture 1"/>
+          <wp:inline distT="0" distB="0" distL="0" distR="0" wp14:anchorId="0C7A5F03" wp14:editId="18FE28EE">
+            <wp:extent cx="5943600" cy="2817495"/>
+            <wp:effectExtent l="0" t="0" r="0" b="1905"/>
+            <wp:docPr id="1562201782" name="Picture 1"/>
             <wp:cNvGraphicFramePr>
               <a:graphicFrameLocks xmlns:a="http://schemas.openxmlformats.org/drawingml/2006/main" noChangeAspect="1"/>
             </wp:cNvGraphicFramePr>
@@ -3004,7 +723,7 @@
               <a:graphicData uri="http://schemas.openxmlformats.org/drawingml/2006/picture">
                 <pic:pic xmlns:pic="http://schemas.openxmlformats.org/drawingml/2006/picture">
                   <pic:nvPicPr>
-                    <pic:cNvPr id="2045849231" name=""/>
+                    <pic:cNvPr id="1562201782" name=""/>
                     <pic:cNvPicPr/>
                   </pic:nvPicPr>
                   <pic:blipFill>
@@ -3016,7 +735,7 @@
                   <pic:spPr>
                     <a:xfrm>
                       <a:off x="0" y="0"/>
-                      <a:ext cx="5943600" cy="1581785"/>
+                      <a:ext cx="5943600" cy="2817495"/>
                     </a:xfrm>
                     <a:prstGeom prst="rect">
                       <a:avLst/>
@@ -3031,18 +750,47 @@
     </w:p>
     <w:p>
       <w:pPr>
-        <w:spacing w:after="80"/>
+        <w:keepNext/>
+        <w:pBdr>
+          <w:bottom w:val="single" w:sz="6" w:space="1" w:color="2B6CAC"/>
+        </w:pBdr>
+        <w:spacing w:before="360" w:after="120"/>
       </w:pPr>
       <w:r>
         <w:rPr>
-          <w:noProof/>
+          <w:b/>
+          <w:color w:val="1A365D"/>
+          <w:sz w:val="28"/>
         </w:rPr>
-        <w:lastRenderedPageBreak/>
+        <w:t>7</w:t>
+      </w:r>
+      <w:r>
+        <w:rPr>
+          <w:b/>
+          <w:color w:val="1A365D"/>
+          <w:sz w:val="28"/>
+        </w:rPr>
+        <w:t>. Data Migration Pipeline</w:t>
+      </w:r>
+    </w:p>
+    <w:p>
+      <w:pPr>
+        <w:spacing w:after="80"/>
+      </w:pPr>
+      <w:r>
+        <w:t>Pipeline Name: PL_S3_To_ADLS</w:t>
+      </w:r>
+    </w:p>
+    <w:p>
+      <w:pPr>
+        <w:spacing w:after="80"/>
+      </w:pPr>
+      <w:r>
         <w:drawing>
-          <wp:inline distT="0" distB="0" distL="0" distR="0" wp14:anchorId="4992EA37" wp14:editId="4DE7616F">
-            <wp:extent cx="5638800" cy="1994063"/>
-            <wp:effectExtent l="0" t="0" r="0" b="6350"/>
-            <wp:docPr id="339988701" name="Picture 1"/>
+          <wp:inline distT="0" distB="0" distL="0" distR="0" wp14:anchorId="29245213" wp14:editId="62A6466A">
+            <wp:extent cx="5543806" cy="3169920"/>
+            <wp:effectExtent l="0" t="0" r="0" b="0"/>
+            <wp:docPr id="328515343" name="Picture 1"/>
             <wp:cNvGraphicFramePr>
               <a:graphicFrameLocks xmlns:a="http://schemas.openxmlformats.org/drawingml/2006/main" noChangeAspect="1"/>
             </wp:cNvGraphicFramePr>
@@ -3050,7 +798,7 @@
               <a:graphicData uri="http://schemas.openxmlformats.org/drawingml/2006/picture">
                 <pic:pic xmlns:pic="http://schemas.openxmlformats.org/drawingml/2006/picture">
                   <pic:nvPicPr>
-                    <pic:cNvPr id="339988701" name=""/>
+                    <pic:cNvPr id="328515343" name=""/>
                     <pic:cNvPicPr/>
                   </pic:nvPicPr>
                   <pic:blipFill>
@@ -3062,7 +810,7 @@
                   <pic:spPr>
                     <a:xfrm>
                       <a:off x="0" y="0"/>
-                      <a:ext cx="5640613" cy="1994704"/>
+                      <a:ext cx="5546504" cy="3171463"/>
                     </a:xfrm>
                     <a:prstGeom prst="rect">
                       <a:avLst/>
@@ -3089,6 +837,239 @@
           <w:color w:val="1A365D"/>
           <w:sz w:val="28"/>
         </w:rPr>
+        <w:lastRenderedPageBreak/>
+        <w:t>8</w:t>
+      </w:r>
+      <w:r>
+        <w:rPr>
+          <w:b/>
+          <w:color w:val="1A365D"/>
+          <w:sz w:val="28"/>
+        </w:rPr>
+        <w:t>. Create Datasets in ADF</w:t>
+      </w:r>
+    </w:p>
+    <w:p>
+      <w:pPr>
+        <w:spacing w:after="40"/>
+      </w:pPr>
+      <w:r>
+        <w:drawing>
+          <wp:inline distT="0" distB="0" distL="0" distR="0" wp14:anchorId="07CDC71E" wp14:editId="7C5C8C0F">
+            <wp:extent cx="2225233" cy="2537680"/>
+            <wp:effectExtent l="0" t="0" r="3810" b="0"/>
+            <wp:docPr id="1913547652" name="Picture 1"/>
+            <wp:cNvGraphicFramePr>
+              <a:graphicFrameLocks xmlns:a="http://schemas.openxmlformats.org/drawingml/2006/main" noChangeAspect="1"/>
+            </wp:cNvGraphicFramePr>
+            <a:graphic xmlns:a="http://schemas.openxmlformats.org/drawingml/2006/main">
+              <a:graphicData uri="http://schemas.openxmlformats.org/drawingml/2006/picture">
+                <pic:pic xmlns:pic="http://schemas.openxmlformats.org/drawingml/2006/picture">
+                  <pic:nvPicPr>
+                    <pic:cNvPr id="1913547652" name=""/>
+                    <pic:cNvPicPr/>
+                  </pic:nvPicPr>
+                  <pic:blipFill>
+                    <a:blip r:embed="rId9"/>
+                    <a:stretch>
+                      <a:fillRect/>
+                    </a:stretch>
+                  </pic:blipFill>
+                  <pic:spPr>
+                    <a:xfrm>
+                      <a:off x="0" y="0"/>
+                      <a:ext cx="2225233" cy="2537680"/>
+                    </a:xfrm>
+                    <a:prstGeom prst="rect">
+                      <a:avLst/>
+                    </a:prstGeom>
+                  </pic:spPr>
+                </pic:pic>
+              </a:graphicData>
+            </a:graphic>
+          </wp:inline>
+        </w:drawing>
+      </w:r>
+    </w:p>
+    <w:p>
+      <w:pPr>
+        <w:keepNext/>
+        <w:pBdr>
+          <w:bottom w:val="single" w:sz="6" w:space="1" w:color="2B6CAC"/>
+        </w:pBdr>
+        <w:spacing w:before="360" w:after="120"/>
+      </w:pPr>
+      <w:r>
+        <w:rPr>
+          <w:b/>
+          <w:color w:val="1A365D"/>
+          <w:sz w:val="28"/>
+        </w:rPr>
+        <w:t>9. Data Transformation Requirements</w:t>
+      </w:r>
+    </w:p>
+    <w:p>
+      <w:pPr>
+        <w:spacing w:after="80"/>
+      </w:pPr>
+      <w:r>
+        <w:t>Pipeline Name: PL_Sales_Transformation</w:t>
+      </w:r>
+    </w:p>
+    <w:p>
+      <w:pPr>
+        <w:spacing w:after="80"/>
+      </w:pPr>
+      <w:r>
+        <w:drawing>
+          <wp:inline distT="0" distB="0" distL="0" distR="0" wp14:anchorId="6028BB27" wp14:editId="21BF5F77">
+            <wp:extent cx="5943600" cy="3355975"/>
+            <wp:effectExtent l="0" t="0" r="0" b="0"/>
+            <wp:docPr id="1814452126" name="Picture 1"/>
+            <wp:cNvGraphicFramePr>
+              <a:graphicFrameLocks xmlns:a="http://schemas.openxmlformats.org/drawingml/2006/main" noChangeAspect="1"/>
+            </wp:cNvGraphicFramePr>
+            <a:graphic xmlns:a="http://schemas.openxmlformats.org/drawingml/2006/main">
+              <a:graphicData uri="http://schemas.openxmlformats.org/drawingml/2006/picture">
+                <pic:pic xmlns:pic="http://schemas.openxmlformats.org/drawingml/2006/picture">
+                  <pic:nvPicPr>
+                    <pic:cNvPr id="1814452126" name=""/>
+                    <pic:cNvPicPr/>
+                  </pic:nvPicPr>
+                  <pic:blipFill>
+                    <a:blip r:embed="rId10"/>
+                    <a:stretch>
+                      <a:fillRect/>
+                    </a:stretch>
+                  </pic:blipFill>
+                  <pic:spPr>
+                    <a:xfrm>
+                      <a:off x="0" y="0"/>
+                      <a:ext cx="5943600" cy="3355975"/>
+                    </a:xfrm>
+                    <a:prstGeom prst="rect">
+                      <a:avLst/>
+                    </a:prstGeom>
+                  </pic:spPr>
+                </pic:pic>
+              </a:graphicData>
+            </a:graphic>
+          </wp:inline>
+        </w:drawing>
+      </w:r>
+    </w:p>
+    <w:p>
+      <w:pPr>
+        <w:spacing w:after="80"/>
+      </w:pPr>
+      <w:r>
+        <w:t>Data Flow Name: DF_Sales_Cleansing</w:t>
+      </w:r>
+    </w:p>
+    <w:p>
+      <w:pPr>
+        <w:spacing w:after="80"/>
+      </w:pPr>
+    </w:p>
+    <w:p>
+      <w:pPr>
+        <w:spacing w:after="80"/>
+      </w:pPr>
+      <w:r>
+        <w:lastRenderedPageBreak/>
+        <w:drawing>
+          <wp:inline distT="0" distB="0" distL="0" distR="0" wp14:anchorId="64F71A5A" wp14:editId="5DEE7C42">
+            <wp:extent cx="5943600" cy="1734820"/>
+            <wp:effectExtent l="0" t="0" r="0" b="0"/>
+            <wp:docPr id="724005829" name="Picture 1"/>
+            <wp:cNvGraphicFramePr>
+              <a:graphicFrameLocks xmlns:a="http://schemas.openxmlformats.org/drawingml/2006/main" noChangeAspect="1"/>
+            </wp:cNvGraphicFramePr>
+            <a:graphic xmlns:a="http://schemas.openxmlformats.org/drawingml/2006/main">
+              <a:graphicData uri="http://schemas.openxmlformats.org/drawingml/2006/picture">
+                <pic:pic xmlns:pic="http://schemas.openxmlformats.org/drawingml/2006/picture">
+                  <pic:nvPicPr>
+                    <pic:cNvPr id="724005829" name=""/>
+                    <pic:cNvPicPr/>
+                  </pic:nvPicPr>
+                  <pic:blipFill>
+                    <a:blip r:embed="rId11"/>
+                    <a:stretch>
+                      <a:fillRect/>
+                    </a:stretch>
+                  </pic:blipFill>
+                  <pic:spPr>
+                    <a:xfrm>
+                      <a:off x="0" y="0"/>
+                      <a:ext cx="5943600" cy="1734820"/>
+                    </a:xfrm>
+                    <a:prstGeom prst="rect">
+                      <a:avLst/>
+                    </a:prstGeom>
+                  </pic:spPr>
+                </pic:pic>
+              </a:graphicData>
+            </a:graphic>
+          </wp:inline>
+        </w:drawing>
+      </w:r>
+    </w:p>
+    <w:p>
+      <w:pPr>
+        <w:spacing w:after="80"/>
+      </w:pPr>
+      <w:r>
+        <w:drawing>
+          <wp:inline distT="0" distB="0" distL="0" distR="0" wp14:anchorId="0E4A1363" wp14:editId="13D981A8">
+            <wp:extent cx="5943600" cy="1938020"/>
+            <wp:effectExtent l="0" t="0" r="0" b="5080"/>
+            <wp:docPr id="988788695" name="Picture 1"/>
+            <wp:cNvGraphicFramePr>
+              <a:graphicFrameLocks xmlns:a="http://schemas.openxmlformats.org/drawingml/2006/main" noChangeAspect="1"/>
+            </wp:cNvGraphicFramePr>
+            <a:graphic xmlns:a="http://schemas.openxmlformats.org/drawingml/2006/main">
+              <a:graphicData uri="http://schemas.openxmlformats.org/drawingml/2006/picture">
+                <pic:pic xmlns:pic="http://schemas.openxmlformats.org/drawingml/2006/picture">
+                  <pic:nvPicPr>
+                    <pic:cNvPr id="988788695" name=""/>
+                    <pic:cNvPicPr/>
+                  </pic:nvPicPr>
+                  <pic:blipFill>
+                    <a:blip r:embed="rId12"/>
+                    <a:stretch>
+                      <a:fillRect/>
+                    </a:stretch>
+                  </pic:blipFill>
+                  <pic:spPr>
+                    <a:xfrm>
+                      <a:off x="0" y="0"/>
+                      <a:ext cx="5943600" cy="1938020"/>
+                    </a:xfrm>
+                    <a:prstGeom prst="rect">
+                      <a:avLst/>
+                    </a:prstGeom>
+                  </pic:spPr>
+                </pic:pic>
+              </a:graphicData>
+            </a:graphic>
+          </wp:inline>
+        </w:drawing>
+      </w:r>
+    </w:p>
+    <w:p>
+      <w:pPr>
+        <w:keepNext/>
+        <w:pBdr>
+          <w:bottom w:val="single" w:sz="6" w:space="1" w:color="2B6CAC"/>
+        </w:pBdr>
+        <w:spacing w:before="360" w:after="120"/>
+      </w:pPr>
+      <w:r>
+        <w:rPr>
+          <w:b/>
+          <w:color w:val="1A365D"/>
+          <w:sz w:val="28"/>
+        </w:rPr>
         <w:t>10. CSV to Parquet Conversion Pipeline</w:t>
       </w:r>
     </w:p>
@@ -3105,9 +1086,52 @@
         <w:spacing w:after="80"/>
       </w:pPr>
       <w:r>
+        <w:drawing>
+          <wp:inline distT="0" distB="0" distL="0" distR="0" wp14:anchorId="6FD15CD5" wp14:editId="61D21CD0">
+            <wp:extent cx="5021580" cy="2846635"/>
+            <wp:effectExtent l="0" t="0" r="7620" b="0"/>
+            <wp:docPr id="125359434" name="Picture 1"/>
+            <wp:cNvGraphicFramePr>
+              <a:graphicFrameLocks xmlns:a="http://schemas.openxmlformats.org/drawingml/2006/main" noChangeAspect="1"/>
+            </wp:cNvGraphicFramePr>
+            <a:graphic xmlns:a="http://schemas.openxmlformats.org/drawingml/2006/main">
+              <a:graphicData uri="http://schemas.openxmlformats.org/drawingml/2006/picture">
+                <pic:pic xmlns:pic="http://schemas.openxmlformats.org/drawingml/2006/picture">
+                  <pic:nvPicPr>
+                    <pic:cNvPr id="125359434" name=""/>
+                    <pic:cNvPicPr/>
+                  </pic:nvPicPr>
+                  <pic:blipFill>
+                    <a:blip r:embed="rId13"/>
+                    <a:stretch>
+                      <a:fillRect/>
+                    </a:stretch>
+                  </pic:blipFill>
+                  <pic:spPr>
+                    <a:xfrm>
+                      <a:off x="0" y="0"/>
+                      <a:ext cx="5026381" cy="2849357"/>
+                    </a:xfrm>
+                    <a:prstGeom prst="rect">
+                      <a:avLst/>
+                    </a:prstGeom>
+                  </pic:spPr>
+                </pic:pic>
+              </a:graphicData>
+            </a:graphic>
+          </wp:inline>
+        </w:drawing>
+      </w:r>
+    </w:p>
+    <w:p>
+      <w:pPr>
+        <w:spacing w:after="80"/>
+      </w:pPr>
+      <w:r>
         <w:rPr>
           <w:noProof/>
         </w:rPr>
+        <w:lastRenderedPageBreak/>
         <w:drawing>
           <wp:inline distT="0" distB="0" distL="0" distR="0" wp14:anchorId="204CB009" wp14:editId="1F3BFEE6">
             <wp:extent cx="5265420" cy="2263118"/>
@@ -3124,7 +1148,7 @@
                     <pic:cNvPicPr/>
                   </pic:nvPicPr>
                   <pic:blipFill>
-                    <a:blip r:embed="rId9"/>
+                    <a:blip r:embed="rId14"/>
                     <a:stretch>
                       <a:fillRect/>
                     </a:stretch>
@@ -3149,46 +1173,6 @@
       <w:pPr>
         <w:spacing w:after="80"/>
       </w:pPr>
-      <w:r>
-        <w:rPr>
-          <w:noProof/>
-        </w:rPr>
-        <w:drawing>
-          <wp:inline distT="0" distB="0" distL="0" distR="0" wp14:anchorId="22EC2DB4" wp14:editId="68D357A0">
-            <wp:extent cx="4267200" cy="2940538"/>
-            <wp:effectExtent l="0" t="0" r="0" b="0"/>
-            <wp:docPr id="74612934" name="Picture 1"/>
-            <wp:cNvGraphicFramePr>
-              <a:graphicFrameLocks xmlns:a="http://schemas.openxmlformats.org/drawingml/2006/main" noChangeAspect="1"/>
-            </wp:cNvGraphicFramePr>
-            <a:graphic xmlns:a="http://schemas.openxmlformats.org/drawingml/2006/main">
-              <a:graphicData uri="http://schemas.openxmlformats.org/drawingml/2006/picture">
-                <pic:pic xmlns:pic="http://schemas.openxmlformats.org/drawingml/2006/picture">
-                  <pic:nvPicPr>
-                    <pic:cNvPr id="74612934" name=""/>
-                    <pic:cNvPicPr/>
-                  </pic:nvPicPr>
-                  <pic:blipFill>
-                    <a:blip r:embed="rId10"/>
-                    <a:stretch>
-                      <a:fillRect/>
-                    </a:stretch>
-                  </pic:blipFill>
-                  <pic:spPr>
-                    <a:xfrm>
-                      <a:off x="0" y="0"/>
-                      <a:ext cx="4268572" cy="2941483"/>
-                    </a:xfrm>
-                    <a:prstGeom prst="rect">
-                      <a:avLst/>
-                    </a:prstGeom>
-                  </pic:spPr>
-                </pic:pic>
-              </a:graphicData>
-            </a:graphic>
-          </wp:inline>
-        </w:drawing>
-      </w:r>
     </w:p>
     <w:p>
       <w:pPr>
@@ -3219,7 +1203,7 @@
                     <pic:cNvPicPr/>
                   </pic:nvPicPr>
                   <pic:blipFill>
-                    <a:blip r:embed="rId11"/>
+                    <a:blip r:embed="rId15"/>
                     <a:stretch>
                       <a:fillRect/>
                     </a:stretch>
@@ -3264,7 +1248,7 @@
                     <pic:cNvPicPr/>
                   </pic:nvPicPr>
                   <pic:blipFill>
-                    <a:blip r:embed="rId12"/>
+                    <a:blip r:embed="rId16"/>
                     <a:stretch>
                       <a:fillRect/>
                     </a:stretch>
@@ -3320,6 +1304,9 @@
         <w:spacing w:after="120"/>
       </w:pPr>
       <w:r>
+        <w:rPr>
+          <w:noProof/>
+        </w:rPr>
         <w:lastRenderedPageBreak/>
         <w:drawing>
           <wp:inline distT="0" distB="0" distL="0" distR="0" wp14:anchorId="494B185B" wp14:editId="26A3B855">
@@ -3337,7 +1324,7 @@
                     <pic:cNvPicPr/>
                   </pic:nvPicPr>
                   <pic:blipFill>
-                    <a:blip r:embed="rId13"/>
+                    <a:blip r:embed="rId17"/>
                     <a:stretch>
                       <a:fillRect/>
                     </a:stretch>
@@ -3385,122 +1372,6 @@
     </w:p>
     <w:p>
       <w:pPr>
-        <w:spacing w:after="80"/>
-      </w:pPr>
-      <w:r>
-        <w:t>Activities:</w:t>
-      </w:r>
-    </w:p>
-    <w:tbl>
-      <w:tblPr>
-        <w:tblW w:w="0" w:type="auto"/>
-        <w:jc w:val="center"/>
-        <w:tblLayout w:type="fixed"/>
-        <w:tblLook w:val="04A0" w:firstRow="1" w:lastRow="0" w:firstColumn="1" w:lastColumn="0" w:noHBand="0" w:noVBand="1"/>
-      </w:tblPr>
-      <w:tblGrid>
-        <w:gridCol w:w="9360"/>
-      </w:tblGrid>
-      <w:tr>
-        <w:trPr>
-          <w:jc w:val="center"/>
-        </w:trPr>
-        <w:tc>
-          <w:tcPr>
-            <w:tcW w:w="9360" w:type="dxa"/>
-            <w:tcBorders>
-              <w:left w:val="single" w:sz="24" w:space="0" w:color="2B6CAC"/>
-            </w:tcBorders>
-            <w:shd w:val="clear" w:color="auto" w:fill="F7FAFC"/>
-            <w:tcMar>
-              <w:top w:w="140" w:type="dxa"/>
-              <w:left w:w="200" w:type="dxa"/>
-              <w:bottom w:w="140" w:type="dxa"/>
-              <w:right w:w="200" w:type="dxa"/>
-            </w:tcMar>
-          </w:tcPr>
-          <w:p>
-            <w:pPr>
-              <w:spacing w:after="80"/>
-            </w:pPr>
-            <w:r>
-              <w:rPr>
-                <w:sz w:val="21"/>
-              </w:rPr>
-              <w:t>Read Parquet</w:t>
-            </w:r>
-          </w:p>
-          <w:p>
-            <w:pPr>
-              <w:spacing w:after="80"/>
-            </w:pPr>
-            <w:r>
-              <w:rPr>
-                <w:sz w:val="21"/>
-              </w:rPr>
-              <w:t xml:space="preserve">   ↓</w:t>
-            </w:r>
-          </w:p>
-          <w:p>
-            <w:pPr>
-              <w:spacing w:after="80"/>
-            </w:pPr>
-            <w:r>
-              <w:rPr>
-                <w:sz w:val="21"/>
-              </w:rPr>
-              <w:t>Validate Schema</w:t>
-            </w:r>
-          </w:p>
-          <w:p>
-            <w:pPr>
-              <w:spacing w:after="80"/>
-            </w:pPr>
-            <w:r>
-              <w:rPr>
-                <w:sz w:val="21"/>
-              </w:rPr>
-              <w:t xml:space="preserve">   ↓</w:t>
-            </w:r>
-          </w:p>
-          <w:p>
-            <w:pPr>
-              <w:spacing w:after="80"/>
-            </w:pPr>
-            <w:r>
-              <w:rPr>
-                <w:sz w:val="21"/>
-              </w:rPr>
-              <w:t>Insert into FactSales</w:t>
-            </w:r>
-          </w:p>
-          <w:p>
-            <w:pPr>
-              <w:spacing w:after="80"/>
-            </w:pPr>
-            <w:r>
-              <w:rPr>
-                <w:sz w:val="21"/>
-              </w:rPr>
-              <w:t xml:space="preserve">   ↓</w:t>
-            </w:r>
-          </w:p>
-          <w:p>
-            <w:pPr>
-              <w:spacing w:after="80"/>
-            </w:pPr>
-            <w:r>
-              <w:rPr>
-                <w:sz w:val="21"/>
-              </w:rPr>
-              <w:t>Audit Logging</w:t>
-            </w:r>
-          </w:p>
-        </w:tc>
-      </w:tr>
-    </w:tbl>
-    <w:p>
-      <w:pPr>
         <w:keepNext/>
         <w:pBdr>
           <w:bottom w:val="single" w:sz="6" w:space="1" w:color="2B6CAC"/>
@@ -3512,15 +1383,100 @@
           <w:sz w:val="28"/>
         </w:rPr>
       </w:pPr>
-      <w:r>
+    </w:p>
+    <w:p>
+      <w:pPr>
+        <w:keepNext/>
+        <w:pBdr>
+          <w:bottom w:val="single" w:sz="6" w:space="1" w:color="2B6CAC"/>
+        </w:pBdr>
+        <w:spacing w:before="360" w:after="120"/>
         <w:rPr>
           <w:b/>
           <w:color w:val="1A365D"/>
           <w:sz w:val="28"/>
         </w:rPr>
-        <w:lastRenderedPageBreak/>
+      </w:pPr>
+      <w:r>
+        <w:rPr>
+          <w:b/>
+          <w:noProof/>
+          <w:color w:val="1A365D"/>
+          <w:sz w:val="28"/>
+        </w:rPr>
         <w:drawing>
-          <wp:inline distT="0" distB="0" distL="0" distR="0" wp14:anchorId="01930BAF" wp14:editId="750A150C">
+          <wp:inline distT="0" distB="0" distL="0" distR="0" wp14:anchorId="483305CA" wp14:editId="494A30FB">
+            <wp:extent cx="5943600" cy="2565400"/>
+            <wp:effectExtent l="0" t="0" r="0" b="6350"/>
+            <wp:docPr id="1474075969" name="Picture 1"/>
+            <wp:cNvGraphicFramePr>
+              <a:graphicFrameLocks xmlns:a="http://schemas.openxmlformats.org/drawingml/2006/main" noChangeAspect="1"/>
+            </wp:cNvGraphicFramePr>
+            <a:graphic xmlns:a="http://schemas.openxmlformats.org/drawingml/2006/main">
+              <a:graphicData uri="http://schemas.openxmlformats.org/drawingml/2006/picture">
+                <pic:pic xmlns:pic="http://schemas.openxmlformats.org/drawingml/2006/picture">
+                  <pic:nvPicPr>
+                    <pic:cNvPr id="1474075969" name=""/>
+                    <pic:cNvPicPr/>
+                  </pic:nvPicPr>
+                  <pic:blipFill>
+                    <a:blip r:embed="rId18"/>
+                    <a:stretch>
+                      <a:fillRect/>
+                    </a:stretch>
+                  </pic:blipFill>
+                  <pic:spPr>
+                    <a:xfrm>
+                      <a:off x="0" y="0"/>
+                      <a:ext cx="5943600" cy="2565400"/>
+                    </a:xfrm>
+                    <a:prstGeom prst="rect">
+                      <a:avLst/>
+                    </a:prstGeom>
+                  </pic:spPr>
+                </pic:pic>
+              </a:graphicData>
+            </a:graphic>
+          </wp:inline>
+        </w:drawing>
+      </w:r>
+    </w:p>
+    <w:p>
+      <w:pPr>
+        <w:keepNext/>
+        <w:pBdr>
+          <w:bottom w:val="single" w:sz="6" w:space="1" w:color="2B6CAC"/>
+        </w:pBdr>
+        <w:spacing w:before="360" w:after="120"/>
+        <w:rPr>
+          <w:b/>
+          <w:color w:val="1A365D"/>
+          <w:sz w:val="28"/>
+        </w:rPr>
+      </w:pPr>
+    </w:p>
+    <w:p>
+      <w:pPr>
+        <w:keepNext/>
+        <w:pBdr>
+          <w:bottom w:val="single" w:sz="6" w:space="1" w:color="2B6CAC"/>
+        </w:pBdr>
+        <w:spacing w:before="360" w:after="120"/>
+        <w:rPr>
+          <w:b/>
+          <w:color w:val="1A365D"/>
+          <w:sz w:val="28"/>
+        </w:rPr>
+      </w:pPr>
+      <w:r>
+        <w:rPr>
+          <w:b/>
+          <w:noProof/>
+          <w:color w:val="1A365D"/>
+          <w:sz w:val="28"/>
+        </w:rPr>
+        <w:drawing>
+          <wp:inline distT="0" distB="0" distL="0" distR="0" wp14:anchorId="26CA4BCC" wp14:editId="39CAA75A">
             <wp:extent cx="5250180" cy="2917889"/>
             <wp:effectExtent l="0" t="0" r="7620" b="0"/>
             <wp:docPr id="841027042" name="Picture 1"/>
@@ -3535,7 +1491,7 @@
                     <pic:cNvPicPr/>
                   </pic:nvPicPr>
                   <pic:blipFill>
-                    <a:blip r:embed="rId14"/>
+                    <a:blip r:embed="rId19"/>
                     <a:stretch>
                       <a:fillRect/>
                     </a:stretch>
@@ -3575,11 +1531,12 @@
           <w:color w:val="1A365D"/>
           <w:sz w:val="28"/>
         </w:rPr>
+        <w:lastRenderedPageBreak/>
         <w:drawing>
-          <wp:inline distT="0" distB="0" distL="0" distR="0" wp14:anchorId="483305CA" wp14:editId="494A30FB">
-            <wp:extent cx="5943600" cy="2565400"/>
-            <wp:effectExtent l="0" t="0" r="0" b="6350"/>
-            <wp:docPr id="1474075969" name="Picture 1"/>
+          <wp:inline distT="0" distB="0" distL="0" distR="0" wp14:anchorId="660B322D" wp14:editId="2E022164">
+            <wp:extent cx="5943600" cy="3369945"/>
+            <wp:effectExtent l="0" t="0" r="0" b="1905"/>
+            <wp:docPr id="1377117088" name="Picture 1"/>
             <wp:cNvGraphicFramePr>
               <a:graphicFrameLocks xmlns:a="http://schemas.openxmlformats.org/drawingml/2006/main" noChangeAspect="1"/>
             </wp:cNvGraphicFramePr>
@@ -3587,11 +1544,11 @@
               <a:graphicData uri="http://schemas.openxmlformats.org/drawingml/2006/picture">
                 <pic:pic xmlns:pic="http://schemas.openxmlformats.org/drawingml/2006/picture">
                   <pic:nvPicPr>
-                    <pic:cNvPr id="1474075969" name=""/>
+                    <pic:cNvPr id="1377117088" name=""/>
                     <pic:cNvPicPr/>
                   </pic:nvPicPr>
                   <pic:blipFill>
-                    <a:blip r:embed="rId15"/>
+                    <a:blip r:embed="rId20"/>
                     <a:stretch>
                       <a:fillRect/>
                     </a:stretch>
@@ -3599,7 +1556,7 @@
                   <pic:spPr>
                     <a:xfrm>
                       <a:off x="0" y="0"/>
-                      <a:ext cx="5943600" cy="2565400"/>
+                      <a:ext cx="5943600" cy="3369945"/>
                     </a:xfrm>
                     <a:prstGeom prst="rect">
                       <a:avLst/>
@@ -3619,20 +1576,6 @@
           <w:bottom w:val="single" w:sz="6" w:space="1" w:color="2B6CAC"/>
         </w:pBdr>
         <w:spacing w:before="360" w:after="120"/>
-        <w:rPr>
-          <w:b/>
-          <w:color w:val="1A365D"/>
-          <w:sz w:val="28"/>
-        </w:rPr>
-      </w:pPr>
-    </w:p>
-    <w:p>
-      <w:pPr>
-        <w:keepNext/>
-        <w:pBdr>
-          <w:bottom w:val="single" w:sz="6" w:space="1" w:color="2B6CAC"/>
-        </w:pBdr>
-        <w:spacing w:before="360" w:after="120"/>
       </w:pPr>
       <w:r>
         <w:rPr>
@@ -3656,209 +1599,11 @@
         <w:spacing w:after="80"/>
       </w:pPr>
       <w:r>
-        <w:t>Process:</w:t>
-      </w:r>
-    </w:p>
-    <w:tbl>
-      <w:tblPr>
-        <w:tblW w:w="0" w:type="auto"/>
-        <w:jc w:val="center"/>
-        <w:tblLayout w:type="fixed"/>
-        <w:tblLook w:val="04A0" w:firstRow="1" w:lastRow="0" w:firstColumn="1" w:lastColumn="0" w:noHBand="0" w:noVBand="1"/>
-      </w:tblPr>
-      <w:tblGrid>
-        <w:gridCol w:w="9360"/>
-      </w:tblGrid>
-      <w:tr>
-        <w:trPr>
-          <w:jc w:val="center"/>
-        </w:trPr>
-        <w:tc>
-          <w:tcPr>
-            <w:tcW w:w="9360" w:type="dxa"/>
-            <w:tcBorders>
-              <w:left w:val="single" w:sz="24" w:space="0" w:color="2B6CAC"/>
-            </w:tcBorders>
-            <w:shd w:val="clear" w:color="auto" w:fill="F7FAFC"/>
-            <w:tcMar>
-              <w:top w:w="140" w:type="dxa"/>
-              <w:left w:w="200" w:type="dxa"/>
-              <w:bottom w:w="140" w:type="dxa"/>
-              <w:right w:w="200" w:type="dxa"/>
-            </w:tcMar>
-          </w:tcPr>
-          <w:p>
-            <w:pPr>
-              <w:spacing w:after="80"/>
-            </w:pPr>
-            <w:r>
-              <w:rPr>
-                <w:sz w:val="21"/>
-              </w:rPr>
-              <w:t>New CSV File Uploaded</w:t>
-            </w:r>
-          </w:p>
-          <w:p>
-            <w:pPr>
-              <w:spacing w:after="80"/>
-            </w:pPr>
-            <w:r>
-              <w:rPr>
-                <w:sz w:val="21"/>
-              </w:rPr>
-              <w:t xml:space="preserve">   ↓</w:t>
-            </w:r>
-          </w:p>
-          <w:p>
-            <w:pPr>
-              <w:spacing w:after="80"/>
-            </w:pPr>
-            <w:r>
-              <w:rPr>
-                <w:sz w:val="21"/>
-              </w:rPr>
-              <w:t>ADF Trigger Starts</w:t>
-            </w:r>
-          </w:p>
-          <w:p>
-            <w:pPr>
-              <w:spacing w:after="80"/>
-            </w:pPr>
-            <w:r>
-              <w:rPr>
-                <w:sz w:val="21"/>
-              </w:rPr>
-              <w:lastRenderedPageBreak/>
-              <w:t xml:space="preserve">   ↓</w:t>
-            </w:r>
-          </w:p>
-          <w:p>
-            <w:pPr>
-              <w:spacing w:after="80"/>
-            </w:pPr>
-            <w:r>
-              <w:rPr>
-                <w:sz w:val="21"/>
-              </w:rPr>
-              <w:t>Migration Pipeline</w:t>
-            </w:r>
-          </w:p>
-          <w:p>
-            <w:pPr>
-              <w:spacing w:after="80"/>
-            </w:pPr>
-            <w:r>
-              <w:rPr>
-                <w:sz w:val="21"/>
-              </w:rPr>
-              <w:t xml:space="preserve">   ↓</w:t>
-            </w:r>
-          </w:p>
-          <w:p>
-            <w:pPr>
-              <w:spacing w:after="80"/>
-            </w:pPr>
-            <w:r>
-              <w:rPr>
-                <w:sz w:val="21"/>
-              </w:rPr>
-              <w:t>Transformation Pipeline</w:t>
-            </w:r>
-          </w:p>
-          <w:p>
-            <w:pPr>
-              <w:spacing w:after="80"/>
-            </w:pPr>
-            <w:r>
-              <w:rPr>
-                <w:sz w:val="21"/>
-              </w:rPr>
-              <w:t xml:space="preserve">   ↓</w:t>
-            </w:r>
-          </w:p>
-          <w:p>
-            <w:pPr>
-              <w:spacing w:after="80"/>
-            </w:pPr>
-            <w:r>
-              <w:rPr>
-                <w:sz w:val="21"/>
-              </w:rPr>
-              <w:t>Parquet Conversion</w:t>
-            </w:r>
-          </w:p>
-          <w:p>
-            <w:pPr>
-              <w:spacing w:after="80"/>
-            </w:pPr>
-            <w:r>
-              <w:rPr>
-                <w:sz w:val="21"/>
-              </w:rPr>
-              <w:t xml:space="preserve">   ↓</w:t>
-            </w:r>
-          </w:p>
-          <w:p>
-            <w:pPr>
-              <w:spacing w:after="80"/>
-            </w:pPr>
-            <w:r>
-              <w:rPr>
-                <w:sz w:val="21"/>
-              </w:rPr>
-              <w:t>SQL Load</w:t>
-            </w:r>
-          </w:p>
-          <w:p>
-            <w:pPr>
-              <w:spacing w:after="80"/>
-            </w:pPr>
-            <w:r>
-              <w:rPr>
-                <w:sz w:val="21"/>
-              </w:rPr>
-              <w:t xml:space="preserve">   ↓</w:t>
-            </w:r>
-          </w:p>
-          <w:p>
-            <w:pPr>
-              <w:spacing w:after="80"/>
-            </w:pPr>
-            <w:r>
-              <w:rPr>
-                <w:sz w:val="21"/>
-              </w:rPr>
-              <w:t>Success Notification</w:t>
-            </w:r>
-          </w:p>
-        </w:tc>
-      </w:tr>
-    </w:tbl>
-    <w:p>
-      <w:pPr>
-        <w:keepNext/>
-        <w:pBdr>
-          <w:bottom w:val="single" w:sz="6" w:space="1" w:color="2B6CAC"/>
-        </w:pBdr>
-        <w:spacing w:before="360" w:after="120"/>
-        <w:rPr>
-          <w:b/>
-          <w:color w:val="1A365D"/>
-          <w:sz w:val="28"/>
-        </w:rPr>
-      </w:pPr>
-      <w:r>
-        <w:rPr>
-          <w:b/>
-          <w:color w:val="1A365D"/>
-          <w:sz w:val="28"/>
-        </w:rPr>
-        <w:lastRenderedPageBreak/>
         <w:drawing>
-          <wp:inline distT="0" distB="0" distL="0" distR="0" wp14:anchorId="56EC0C77" wp14:editId="620832B9">
-            <wp:extent cx="5943600" cy="2346960"/>
+          <wp:inline distT="0" distB="0" distL="0" distR="0" wp14:anchorId="7D9C647E" wp14:editId="63B4669B">
+            <wp:extent cx="5943600" cy="3378200"/>
             <wp:effectExtent l="0" t="0" r="0" b="0"/>
-            <wp:docPr id="1352480350" name="Picture 1"/>
+            <wp:docPr id="1653263658" name="Picture 1"/>
             <wp:cNvGraphicFramePr>
               <a:graphicFrameLocks xmlns:a="http://schemas.openxmlformats.org/drawingml/2006/main" noChangeAspect="1"/>
             </wp:cNvGraphicFramePr>
@@ -3866,11 +1611,11 @@
               <a:graphicData uri="http://schemas.openxmlformats.org/drawingml/2006/picture">
                 <pic:pic xmlns:pic="http://schemas.openxmlformats.org/drawingml/2006/picture">
                   <pic:nvPicPr>
-                    <pic:cNvPr id="1352480350" name=""/>
+                    <pic:cNvPr id="1653263658" name=""/>
                     <pic:cNvPicPr/>
                   </pic:nvPicPr>
                   <pic:blipFill>
-                    <a:blip r:embed="rId16"/>
+                    <a:blip r:embed="rId21"/>
                     <a:stretch>
                       <a:fillRect/>
                     </a:stretch>
@@ -3878,7 +1623,7 @@
                   <pic:spPr>
                     <a:xfrm>
                       <a:off x="0" y="0"/>
-                      <a:ext cx="5943600" cy="2346960"/>
+                      <a:ext cx="5943600" cy="3378200"/>
                     </a:xfrm>
                     <a:prstGeom prst="rect">
                       <a:avLst/>
@@ -3893,6 +1638,11 @@
     </w:p>
     <w:p>
       <w:pPr>
+        <w:spacing w:after="80"/>
+      </w:pPr>
+    </w:p>
+    <w:p>
+      <w:pPr>
         <w:keepNext/>
         <w:pBdr>
           <w:bottom w:val="single" w:sz="6" w:space="1" w:color="2B6CAC"/>
@@ -3904,6 +1654,34 @@
           <w:sz w:val="28"/>
         </w:rPr>
       </w:pPr>
+    </w:p>
+    <w:p>
+      <w:pPr>
+        <w:keepNext/>
+        <w:pBdr>
+          <w:bottom w:val="single" w:sz="6" w:space="1" w:color="2B6CAC"/>
+        </w:pBdr>
+        <w:spacing w:before="360" w:after="120"/>
+        <w:rPr>
+          <w:b/>
+          <w:color w:val="1A365D"/>
+          <w:sz w:val="28"/>
+        </w:rPr>
+      </w:pPr>
+    </w:p>
+    <w:p>
+      <w:pPr>
+        <w:keepNext/>
+        <w:pBdr>
+          <w:bottom w:val="single" w:sz="6" w:space="1" w:color="2B6CAC"/>
+        </w:pBdr>
+        <w:spacing w:before="360" w:after="120"/>
+        <w:rPr>
+          <w:b/>
+          <w:color w:val="1A365D"/>
+          <w:sz w:val="28"/>
+        </w:rPr>
+      </w:pPr>
       <w:r>
         <w:rPr>
           <w:b/>
@@ -3911,10 +1689,10 @@
           <w:sz w:val="28"/>
         </w:rPr>
         <w:drawing>
-          <wp:inline distT="0" distB="0" distL="0" distR="0" wp14:anchorId="7580FCDE" wp14:editId="4AFFDB24">
-            <wp:extent cx="5943600" cy="2613025"/>
-            <wp:effectExtent l="0" t="0" r="0" b="0"/>
-            <wp:docPr id="583797781" name="Picture 1"/>
+          <wp:inline distT="0" distB="0" distL="0" distR="0" wp14:anchorId="02DD221B" wp14:editId="615636FE">
+            <wp:extent cx="5943600" cy="1781175"/>
+            <wp:effectExtent l="0" t="0" r="0" b="9525"/>
+            <wp:docPr id="800107196" name="Picture 1"/>
             <wp:cNvGraphicFramePr>
               <a:graphicFrameLocks xmlns:a="http://schemas.openxmlformats.org/drawingml/2006/main" noChangeAspect="1"/>
             </wp:cNvGraphicFramePr>
@@ -3922,11 +1700,11 @@
               <a:graphicData uri="http://schemas.openxmlformats.org/drawingml/2006/picture">
                 <pic:pic xmlns:pic="http://schemas.openxmlformats.org/drawingml/2006/picture">
                   <pic:nvPicPr>
-                    <pic:cNvPr id="583797781" name=""/>
+                    <pic:cNvPr id="800107196" name=""/>
                     <pic:cNvPicPr/>
                   </pic:nvPicPr>
                   <pic:blipFill>
-                    <a:blip r:embed="rId17"/>
+                    <a:blip r:embed="rId22"/>
                     <a:stretch>
                       <a:fillRect/>
                     </a:stretch>
@@ -3934,7 +1712,7 @@
                   <pic:spPr>
                     <a:xfrm>
                       <a:off x="0" y="0"/>
-                      <a:ext cx="5943600" cy="2613025"/>
+                      <a:ext cx="5943600" cy="1781175"/>
                     </a:xfrm>
                     <a:prstGeom prst="rect">
                       <a:avLst/>
@@ -3967,10 +1745,10 @@
           <w:sz w:val="28"/>
         </w:rPr>
         <w:drawing>
-          <wp:inline distT="0" distB="0" distL="0" distR="0" wp14:anchorId="6CA87948" wp14:editId="5EF9B81C">
-            <wp:extent cx="5943600" cy="2617470"/>
+          <wp:inline distT="0" distB="0" distL="0" distR="0" wp14:anchorId="6A02B01B" wp14:editId="70CC396B">
+            <wp:extent cx="5943600" cy="3395345"/>
             <wp:effectExtent l="0" t="0" r="0" b="0"/>
-            <wp:docPr id="1221369060" name="Picture 1"/>
+            <wp:docPr id="652561446" name="Picture 1"/>
             <wp:cNvGraphicFramePr>
               <a:graphicFrameLocks xmlns:a="http://schemas.openxmlformats.org/drawingml/2006/main" noChangeAspect="1"/>
             </wp:cNvGraphicFramePr>
@@ -3978,11 +1756,11 @@
               <a:graphicData uri="http://schemas.openxmlformats.org/drawingml/2006/picture">
                 <pic:pic xmlns:pic="http://schemas.openxmlformats.org/drawingml/2006/picture">
                   <pic:nvPicPr>
-                    <pic:cNvPr id="1221369060" name=""/>
+                    <pic:cNvPr id="652561446" name=""/>
                     <pic:cNvPicPr/>
                   </pic:nvPicPr>
                   <pic:blipFill>
-                    <a:blip r:embed="rId18"/>
+                    <a:blip r:embed="rId23"/>
                     <a:stretch>
                       <a:fillRect/>
                     </a:stretch>
@@ -3990,7 +1768,7 @@
                   <pic:spPr>
                     <a:xfrm>
                       <a:off x="0" y="0"/>
-                      <a:ext cx="5943600" cy="2617470"/>
+                      <a:ext cx="5943600" cy="3395345"/>
                     </a:xfrm>
                     <a:prstGeom prst="rect">
                       <a:avLst/>
@@ -4010,20 +1788,6 @@
           <w:bottom w:val="single" w:sz="6" w:space="1" w:color="2B6CAC"/>
         </w:pBdr>
         <w:spacing w:before="360" w:after="120"/>
-        <w:rPr>
-          <w:b/>
-          <w:color w:val="1A365D"/>
-          <w:sz w:val="28"/>
-        </w:rPr>
-      </w:pPr>
-    </w:p>
-    <w:p>
-      <w:pPr>
-        <w:keepNext/>
-        <w:pBdr>
-          <w:bottom w:val="single" w:sz="6" w:space="1" w:color="2B6CAC"/>
-        </w:pBdr>
-        <w:spacing w:before="360" w:after="120"/>
       </w:pPr>
       <w:r>
         <w:rPr>
@@ -4049,6 +1813,55 @@
       </w:pPr>
       <w:r>
         <w:t>Pipeline Success Rate</w:t>
+      </w:r>
+    </w:p>
+    <w:p>
+      <w:pPr>
+        <w:pStyle w:val="ListBullet"/>
+        <w:numPr>
+          <w:ilvl w:val="0"/>
+          <w:numId w:val="0"/>
+        </w:numPr>
+        <w:spacing w:after="60"/>
+        <w:ind w:left="360" w:hanging="360"/>
+      </w:pPr>
+      <w:r>
+        <w:lastRenderedPageBreak/>
+        <w:drawing>
+          <wp:inline distT="0" distB="0" distL="0" distR="0" wp14:anchorId="73E5EA6D" wp14:editId="2648BB50">
+            <wp:extent cx="5943600" cy="3399790"/>
+            <wp:effectExtent l="0" t="0" r="0" b="0"/>
+            <wp:docPr id="1797557154" name="Picture 1"/>
+            <wp:cNvGraphicFramePr>
+              <a:graphicFrameLocks xmlns:a="http://schemas.openxmlformats.org/drawingml/2006/main" noChangeAspect="1"/>
+            </wp:cNvGraphicFramePr>
+            <a:graphic xmlns:a="http://schemas.openxmlformats.org/drawingml/2006/main">
+              <a:graphicData uri="http://schemas.openxmlformats.org/drawingml/2006/picture">
+                <pic:pic xmlns:pic="http://schemas.openxmlformats.org/drawingml/2006/picture">
+                  <pic:nvPicPr>
+                    <pic:cNvPr id="1797557154" name=""/>
+                    <pic:cNvPicPr/>
+                  </pic:nvPicPr>
+                  <pic:blipFill>
+                    <a:blip r:embed="rId24"/>
+                    <a:stretch>
+                      <a:fillRect/>
+                    </a:stretch>
+                  </pic:blipFill>
+                  <pic:spPr>
+                    <a:xfrm>
+                      <a:off x="0" y="0"/>
+                      <a:ext cx="5943600" cy="3399790"/>
+                    </a:xfrm>
+                    <a:prstGeom prst="rect">
+                      <a:avLst/>
+                    </a:prstGeom>
+                  </pic:spPr>
+                </pic:pic>
+              </a:graphicData>
+            </a:graphic>
+          </wp:inline>
+        </w:drawing>
       </w:r>
     </w:p>
     <w:p>
@@ -4393,6 +2206,7 @@
               <w:rPr>
                 <w:sz w:val="20"/>
               </w:rPr>
+              <w:lastRenderedPageBreak/>
               <w:t>Data Factory</w:t>
             </w:r>
           </w:p>
@@ -4626,7 +2440,6 @@
               <w:rPr>
                 <w:sz w:val="20"/>
               </w:rPr>
-              <w:lastRenderedPageBreak/>
               <w:t>Trigger</w:t>
             </w:r>
           </w:p>

</xml_diff>